<commit_message>
Fixed site plan / Link
</commit_message>
<xml_diff>
--- a/Plan/Site Plan.docx
+++ b/Plan/Site Plan.docx
@@ -1,6 +1,6 @@
 
 <file path=word/document.xml><?xml version="1.0" encoding="utf-8"?>
-<w:document xmlns:mc="http://schemas.openxmlformats.org/markup-compatibility/2006" xmlns:ve="http://schemas.openxmlformats.org/markup-compatibility/2006" xmlns:o="urn:schemas-microsoft-com:office:office" xmlns:r="http://schemas.openxmlformats.org/officeDocument/2006/relationships" xmlns:m="http://schemas.openxmlformats.org/officeDocument/2006/math" xmlns:v="urn:schemas-microsoft-com:vml" xmlns:wp="http://schemas.openxmlformats.org/drawingml/2006/wordprocessingDrawing" xmlns:w10="urn:schemas-microsoft-com:office:word" xmlns:w="http://schemas.openxmlformats.org/wordprocessingml/2006/main" xmlns:wne="http://schemas.microsoft.com/office/word/2006/wordml" xmlns:a="http://schemas.openxmlformats.org/drawingml/2006/main" xmlns:pic="http://schemas.openxmlformats.org/drawingml/2006/picture" xmlns:wpg="http://schemas.microsoft.com/office/word/2010/wordprocessingGroup" xmlns:wps="http://schemas.microsoft.com/office/word/2010/wordprocessingShape" xmlns:w14="http://schemas.microsoft.com/office/word/2010/wordml" mc:Ignorable="w14" xml:space="preserve">
+<w:document xmlns:wpc="http://schemas.microsoft.com/office/word/2010/wordprocessingCanvas" xmlns:cx="http://schemas.microsoft.com/office/drawing/2014/chartex" xmlns:cx1="http://schemas.microsoft.com/office/drawing/2015/9/8/chartex" xmlns:cx2="http://schemas.microsoft.com/office/drawing/2015/10/21/chartex" xmlns:cx3="http://schemas.microsoft.com/office/drawing/2016/5/9/chartex" xmlns:cx4="http://schemas.microsoft.com/office/drawing/2016/5/10/chartex" xmlns:cx5="http://schemas.microsoft.com/office/drawing/2016/5/11/chartex" xmlns:cx6="http://schemas.microsoft.com/office/drawing/2016/5/12/chartex" xmlns:cx7="http://schemas.microsoft.com/office/drawing/2016/5/13/chartex" xmlns:cx8="http://schemas.microsoft.com/office/drawing/2016/5/14/chartex" xmlns:mc="http://schemas.openxmlformats.org/markup-compatibility/2006" xmlns:aink="http://schemas.microsoft.com/office/drawing/2016/ink" xmlns:am3d="http://schemas.microsoft.com/office/drawing/2017/model3d" xmlns:o="urn:schemas-microsoft-com:office:office" xmlns:oel="http://schemas.microsoft.com/office/2019/extlst" xmlns:r="http://schemas.openxmlformats.org/officeDocument/2006/relationships" xmlns:m="http://schemas.openxmlformats.org/officeDocument/2006/math" xmlns:v="urn:schemas-microsoft-com:vml" xmlns:wp14="http://schemas.microsoft.com/office/word/2010/wordprocessingDrawing" xmlns:wp="http://schemas.openxmlformats.org/drawingml/2006/wordprocessingDrawing" xmlns:w10="urn:schemas-microsoft-com:office:word" xmlns:w="http://schemas.openxmlformats.org/wordprocessingml/2006/main" xmlns:w14="http://schemas.microsoft.com/office/word/2010/wordml" xmlns:w15="http://schemas.microsoft.com/office/word/2012/wordml" xmlns:w16cex="http://schemas.microsoft.com/office/word/2018/wordml/cex" xmlns:w16cid="http://schemas.microsoft.com/office/word/2016/wordml/cid" xmlns:w16="http://schemas.microsoft.com/office/word/2018/wordml" xmlns:w16du="http://schemas.microsoft.com/office/word/2023/wordml/word16du" xmlns:w16sdtdh="http://schemas.microsoft.com/office/word/2020/wordml/sdtdatahash" xmlns:w16sdtfl="http://schemas.microsoft.com/office/word/2024/wordml/sdtformatlock" xmlns:w16se="http://schemas.microsoft.com/office/word/2015/wordml/symex" xmlns:wpg="http://schemas.microsoft.com/office/word/2010/wordprocessingGroup" xmlns:wpi="http://schemas.microsoft.com/office/word/2010/wordprocessingInk" xmlns:wne="http://schemas.microsoft.com/office/word/2006/wordml" xmlns:wps="http://schemas.microsoft.com/office/word/2010/wordprocessingShape" mc:Ignorable="w14 w15 w16se w16cid w16 w16cex w16sdtdh w16sdtfl w16du wp14">
   <w:body>
     <w:p>
       <w:pPr>
@@ -23,18 +23,14 @@
     </w:p>
     <w:p>
       <w:pPr>
-        <w:spacing w:before="0"/>
-        <w:ind w:left="4" w:right="281" w:firstLine="0"/>
+        <w:ind w:left="4" w:right="281"/>
         <w:jc w:val="center"/>
         <w:rPr>
           <w:sz w:val="120"/>
         </w:rPr>
       </w:pPr>
-      <w:bookmarkStart w:name="Slide 1: Site Plan" w:id="1"/>
-      <w:bookmarkEnd w:id="1"/>
-      <w:r>
-        <w:rPr/>
-      </w:r>
+      <w:bookmarkStart w:id="0" w:name="Slide_1:_Site_Plan"/>
+      <w:bookmarkEnd w:id="0"/>
       <w:r>
         <w:rPr>
           <w:w w:val="90"/>
@@ -48,7 +44,7 @@
           <w:w w:val="90"/>
           <w:sz w:val="120"/>
         </w:rPr>
-        <w:t> </w:t>
+        <w:t xml:space="preserve"> </w:t>
       </w:r>
       <w:r>
         <w:rPr>
@@ -61,7 +57,7 @@
     <w:p>
       <w:pPr>
         <w:spacing w:before="293"/>
-        <w:ind w:left="0" w:right="281" w:firstLine="0"/>
+        <w:ind w:right="281"/>
         <w:jc w:val="center"/>
         <w:rPr>
           <w:sz w:val="48"/>
@@ -69,10 +65,11 @@
       </w:pPr>
       <w:r>
         <w:rPr>
+          <w:noProof/>
           <w:sz w:val="48"/>
         </w:rPr>
         <w:drawing>
-          <wp:anchor distT="0" distB="0" distL="0" distR="0" allowOverlap="1" layoutInCell="1" locked="0" behindDoc="0" simplePos="0" relativeHeight="15728640">
+          <wp:anchor distT="0" distB="0" distL="0" distR="0" simplePos="0" relativeHeight="15728640" behindDoc="0" locked="0" layoutInCell="1" allowOverlap="1" wp14:anchorId="68F3B04B" wp14:editId="67BF2D5F">
             <wp:simplePos x="0" y="0"/>
             <wp:positionH relativeFrom="page">
               <wp:posOffset>4555616</wp:posOffset>
@@ -85,17 +82,17 @@
             <wp:wrapNone/>
             <wp:docPr id="1" name="Image 1"/>
             <wp:cNvGraphicFramePr>
-              <a:graphicFrameLocks/>
+              <a:graphicFrameLocks xmlns:a="http://schemas.openxmlformats.org/drawingml/2006/main"/>
             </wp:cNvGraphicFramePr>
-            <a:graphic>
+            <a:graphic xmlns:a="http://schemas.openxmlformats.org/drawingml/2006/main">
               <a:graphicData uri="http://schemas.openxmlformats.org/drawingml/2006/picture">
-                <pic:pic>
+                <pic:pic xmlns:pic="http://schemas.openxmlformats.org/drawingml/2006/picture">
                   <pic:nvPicPr>
                     <pic:cNvPr id="1" name="Image 1"/>
                     <pic:cNvPicPr/>
                   </pic:nvPicPr>
                   <pic:blipFill>
-                    <a:blip r:embed="rId5" cstate="print"/>
+                    <a:blip r:embed="rId4" cstate="print"/>
                     <a:stretch>
                       <a:fillRect/>
                     </a:stretch>
@@ -125,7 +122,6 @@
     </w:p>
     <w:p>
       <w:pPr>
-        <w:spacing w:after="0"/>
         <w:jc w:val="center"/>
         <w:rPr>
           <w:sz w:val="48"/>
@@ -133,29 +129,27 @@
         <w:sectPr>
           <w:type w:val="continuous"/>
           <w:pgSz w:w="19200" w:h="10800" w:orient="landscape"/>
-          <w:pgMar w:top="1220" w:bottom="0" w:left="425" w:right="141"/>
+          <w:pgMar w:top="1220" w:right="141" w:bottom="0" w:left="425" w:header="720" w:footer="720" w:gutter="0"/>
+          <w:cols w:space="720"/>
         </w:sectPr>
       </w:pPr>
     </w:p>
     <w:p>
       <w:pPr>
         <w:spacing w:before="87"/>
-        <w:ind w:left="1039" w:right="0" w:firstLine="0"/>
-        <w:jc w:val="left"/>
+        <w:ind w:left="1039"/>
         <w:rPr>
           <w:sz w:val="88"/>
         </w:rPr>
       </w:pPr>
-      <w:bookmarkStart w:name="Slide 2: Intended Audience" w:id="2"/>
-      <w:bookmarkEnd w:id="2"/>
-      <w:r>
-        <w:rPr/>
-      </w:r>
+      <w:bookmarkStart w:id="1" w:name="Slide_2:_Intended_Audience"/>
+      <w:bookmarkEnd w:id="1"/>
       <w:r>
         <w:rPr>
           <w:w w:val="85"/>
           <w:sz w:val="88"/>
         </w:rPr>
+        <w:lastRenderedPageBreak/>
         <w:t>Intended</w:t>
       </w:r>
       <w:r>
@@ -163,7 +157,7 @@
           <w:spacing w:val="71"/>
           <w:sz w:val="88"/>
         </w:rPr>
-        <w:t> </w:t>
+        <w:t xml:space="preserve"> </w:t>
       </w:r>
       <w:r>
         <w:rPr>
@@ -176,9 +170,8 @@
     </w:p>
     <w:p>
       <w:pPr>
-        <w:spacing w:line="628" w:lineRule="exact" w:before="826"/>
-        <w:ind w:left="1039" w:right="0" w:firstLine="0"/>
-        <w:jc w:val="left"/>
+        <w:spacing w:before="826" w:line="628" w:lineRule="exact"/>
+        <w:ind w:left="1039"/>
         <w:rPr>
           <w:sz w:val="56"/>
         </w:rPr>
@@ -195,7 +188,7 @@
           <w:spacing w:val="-54"/>
           <w:sz w:val="56"/>
         </w:rPr>
-        <w:t> </w:t>
+        <w:t xml:space="preserve"> </w:t>
       </w:r>
       <w:r>
         <w:rPr>
@@ -209,7 +202,7 @@
           <w:spacing w:val="-50"/>
           <w:sz w:val="56"/>
         </w:rPr>
-        <w:t> </w:t>
+        <w:t xml:space="preserve"> </w:t>
       </w:r>
       <w:r>
         <w:rPr>
@@ -223,7 +216,7 @@
           <w:spacing w:val="-50"/>
           <w:sz w:val="56"/>
         </w:rPr>
-        <w:t> </w:t>
+        <w:t xml:space="preserve"> </w:t>
       </w:r>
       <w:r>
         <w:rPr>
@@ -237,7 +230,7 @@
           <w:spacing w:val="-51"/>
           <w:sz w:val="56"/>
         </w:rPr>
-        <w:t> </w:t>
+        <w:t xml:space="preserve"> </w:t>
       </w:r>
       <w:r>
         <w:rPr>
@@ -251,7 +244,7 @@
           <w:spacing w:val="-56"/>
           <w:sz w:val="56"/>
         </w:rPr>
-        <w:t> </w:t>
+        <w:t xml:space="preserve"> </w:t>
       </w:r>
       <w:r>
         <w:rPr>
@@ -265,7 +258,7 @@
           <w:spacing w:val="-51"/>
           <w:sz w:val="56"/>
         </w:rPr>
-        <w:t> </w:t>
+        <w:t xml:space="preserve"> </w:t>
       </w:r>
       <w:r>
         <w:rPr>
@@ -279,7 +272,7 @@
           <w:spacing w:val="-53"/>
           <w:sz w:val="56"/>
         </w:rPr>
-        <w:t> </w:t>
+        <w:t xml:space="preserve"> </w:t>
       </w:r>
       <w:r>
         <w:rPr>
@@ -293,7 +286,7 @@
           <w:spacing w:val="-50"/>
           <w:sz w:val="56"/>
         </w:rPr>
-        <w:t> </w:t>
+        <w:t xml:space="preserve"> </w:t>
       </w:r>
       <w:r>
         <w:rPr>
@@ -307,7 +300,7 @@
           <w:spacing w:val="-51"/>
           <w:sz w:val="56"/>
         </w:rPr>
-        <w:t> </w:t>
+        <w:t xml:space="preserve"> </w:t>
       </w:r>
       <w:r>
         <w:rPr>
@@ -321,7 +314,7 @@
           <w:spacing w:val="-54"/>
           <w:sz w:val="56"/>
         </w:rPr>
-        <w:t> </w:t>
+        <w:t xml:space="preserve"> </w:t>
       </w:r>
       <w:r>
         <w:rPr>
@@ -333,9 +326,8 @@
     </w:p>
     <w:p>
       <w:pPr>
-        <w:spacing w:line="223" w:lineRule="auto" w:before="14"/>
-        <w:ind w:left="1039" w:right="1153" w:firstLine="0"/>
-        <w:jc w:val="left"/>
+        <w:spacing w:before="14" w:line="223" w:lineRule="auto"/>
+        <w:ind w:left="1039" w:right="1153"/>
         <w:rPr>
           <w:sz w:val="56"/>
         </w:rPr>
@@ -352,7 +344,7 @@
           <w:spacing w:val="-52"/>
           <w:sz w:val="56"/>
         </w:rPr>
-        <w:t> </w:t>
+        <w:t xml:space="preserve"> </w:t>
       </w:r>
       <w:r>
         <w:rPr>
@@ -366,7 +358,7 @@
           <w:spacing w:val="-54"/>
           <w:sz w:val="56"/>
         </w:rPr>
-        <w:t> </w:t>
+        <w:t xml:space="preserve"> </w:t>
       </w:r>
       <w:r>
         <w:rPr>
@@ -380,7 +372,7 @@
           <w:spacing w:val="-54"/>
           <w:sz w:val="56"/>
         </w:rPr>
-        <w:t> </w:t>
+        <w:t xml:space="preserve"> </w:t>
       </w:r>
       <w:r>
         <w:rPr>
@@ -394,7 +386,7 @@
           <w:spacing w:val="-53"/>
           <w:sz w:val="56"/>
         </w:rPr>
-        <w:t> </w:t>
+        <w:t xml:space="preserve"> </w:t>
       </w:r>
       <w:r>
         <w:rPr>
@@ -408,7 +400,7 @@
           <w:spacing w:val="-53"/>
           <w:sz w:val="56"/>
         </w:rPr>
-        <w:t> </w:t>
+        <w:t xml:space="preserve"> </w:t>
       </w:r>
       <w:r>
         <w:rPr>
@@ -422,8 +414,9 @@
           <w:spacing w:val="-56"/>
           <w:sz w:val="56"/>
         </w:rPr>
-        <w:t> </w:t>
-      </w:r>
+        <w:t xml:space="preserve"> </w:t>
+      </w:r>
+      <w:proofErr w:type="gramStart"/>
       <w:r>
         <w:rPr>
           <w:spacing w:val="-8"/>
@@ -431,12 +424,13 @@
         </w:rPr>
         <w:t>made</w:t>
       </w:r>
+      <w:proofErr w:type="gramEnd"/>
       <w:r>
         <w:rPr>
           <w:spacing w:val="-54"/>
           <w:sz w:val="56"/>
         </w:rPr>
-        <w:t> </w:t>
+        <w:t xml:space="preserve"> </w:t>
       </w:r>
       <w:r>
         <w:rPr>
@@ -450,7 +444,7 @@
           <w:spacing w:val="-54"/>
           <w:sz w:val="56"/>
         </w:rPr>
-        <w:t> </w:t>
+        <w:t xml:space="preserve"> </w:t>
       </w:r>
       <w:r>
         <w:rPr>
@@ -464,7 +458,7 @@
           <w:spacing w:val="-56"/>
           <w:sz w:val="56"/>
         </w:rPr>
-        <w:t> </w:t>
+        <w:t xml:space="preserve"> </w:t>
       </w:r>
       <w:r>
         <w:rPr>
@@ -478,7 +472,7 @@
           <w:spacing w:val="-56"/>
           <w:sz w:val="56"/>
         </w:rPr>
-        <w:t> </w:t>
+        <w:t xml:space="preserve"> </w:t>
       </w:r>
       <w:r>
         <w:rPr>
@@ -492,7 +486,7 @@
           <w:spacing w:val="-54"/>
           <w:sz w:val="56"/>
         </w:rPr>
-        <w:t> </w:t>
+        <w:t xml:space="preserve"> </w:t>
       </w:r>
       <w:r>
         <w:rPr>
@@ -506,14 +500,14 @@
           <w:spacing w:val="-60"/>
           <w:sz w:val="56"/>
         </w:rPr>
-        <w:t> </w:t>
+        <w:t xml:space="preserve"> </w:t>
       </w:r>
       <w:r>
         <w:rPr>
           <w:spacing w:val="-8"/>
           <w:sz w:val="56"/>
         </w:rPr>
-        <w:t>to </w:t>
+        <w:t xml:space="preserve">to </w:t>
       </w:r>
       <w:r>
         <w:rPr>
@@ -527,7 +521,7 @@
           <w:spacing w:val="-50"/>
           <w:sz w:val="56"/>
         </w:rPr>
-        <w:t> </w:t>
+        <w:t xml:space="preserve"> </w:t>
       </w:r>
       <w:r>
         <w:rPr>
@@ -541,7 +535,7 @@
           <w:spacing w:val="-52"/>
           <w:sz w:val="56"/>
         </w:rPr>
-        <w:t> </w:t>
+        <w:t xml:space="preserve"> </w:t>
       </w:r>
       <w:r>
         <w:rPr>
@@ -555,7 +549,7 @@
           <w:spacing w:val="-52"/>
           <w:sz w:val="56"/>
         </w:rPr>
-        <w:t> </w:t>
+        <w:t xml:space="preserve"> </w:t>
       </w:r>
       <w:r>
         <w:rPr>
@@ -569,7 +563,7 @@
           <w:spacing w:val="-53"/>
           <w:sz w:val="56"/>
         </w:rPr>
-        <w:t> </w:t>
+        <w:t xml:space="preserve"> </w:t>
       </w:r>
       <w:r>
         <w:rPr>
@@ -583,7 +577,7 @@
           <w:spacing w:val="-54"/>
           <w:sz w:val="56"/>
         </w:rPr>
-        <w:t> </w:t>
+        <w:t xml:space="preserve"> </w:t>
       </w:r>
       <w:r>
         <w:rPr>
@@ -597,7 +591,7 @@
           <w:spacing w:val="-49"/>
           <w:sz w:val="56"/>
         </w:rPr>
-        <w:t> </w:t>
+        <w:t xml:space="preserve"> </w:t>
       </w:r>
       <w:r>
         <w:rPr>
@@ -611,7 +605,7 @@
           <w:spacing w:val="-51"/>
           <w:sz w:val="56"/>
         </w:rPr>
-        <w:t> </w:t>
+        <w:t xml:space="preserve"> </w:t>
       </w:r>
       <w:r>
         <w:rPr>
@@ -625,7 +619,7 @@
           <w:spacing w:val="-52"/>
           <w:sz w:val="56"/>
         </w:rPr>
-        <w:t> </w:t>
+        <w:t xml:space="preserve"> </w:t>
       </w:r>
       <w:r>
         <w:rPr>
@@ -639,7 +633,7 @@
           <w:spacing w:val="-54"/>
           <w:sz w:val="56"/>
         </w:rPr>
-        <w:t> </w:t>
+        <w:t xml:space="preserve"> </w:t>
       </w:r>
       <w:r>
         <w:rPr>
@@ -653,14 +647,14 @@
           <w:spacing w:val="-49"/>
           <w:sz w:val="56"/>
         </w:rPr>
-        <w:t> </w:t>
+        <w:t xml:space="preserve"> </w:t>
       </w:r>
       <w:r>
         <w:rPr>
           <w:spacing w:val="-2"/>
           <w:sz w:val="56"/>
         </w:rPr>
-        <w:t>for </w:t>
+        <w:t xml:space="preserve">for </w:t>
       </w:r>
       <w:r>
         <w:rPr>
@@ -674,7 +668,7 @@
           <w:spacing w:val="-54"/>
           <w:sz w:val="56"/>
         </w:rPr>
-        <w:t> </w:t>
+        <w:t xml:space="preserve"> </w:t>
       </w:r>
       <w:r>
         <w:rPr>
@@ -688,7 +682,7 @@
           <w:spacing w:val="-51"/>
           <w:sz w:val="56"/>
         </w:rPr>
-        <w:t> </w:t>
+        <w:t xml:space="preserve"> </w:t>
       </w:r>
       <w:r>
         <w:rPr>
@@ -702,7 +696,7 @@
           <w:spacing w:val="-52"/>
           <w:sz w:val="56"/>
         </w:rPr>
-        <w:t> </w:t>
+        <w:t xml:space="preserve"> </w:t>
       </w:r>
       <w:r>
         <w:rPr>
@@ -716,7 +710,7 @@
           <w:spacing w:val="-54"/>
           <w:sz w:val="56"/>
         </w:rPr>
-        <w:t> </w:t>
+        <w:t xml:space="preserve"> </w:t>
       </w:r>
       <w:r>
         <w:rPr>
@@ -730,7 +724,7 @@
           <w:spacing w:val="-51"/>
           <w:sz w:val="56"/>
         </w:rPr>
-        <w:t> </w:t>
+        <w:t xml:space="preserve"> </w:t>
       </w:r>
       <w:r>
         <w:rPr>
@@ -742,14 +736,14 @@
     </w:p>
     <w:p>
       <w:pPr>
-        <w:spacing w:after="0" w:line="223" w:lineRule="auto"/>
-        <w:jc w:val="left"/>
+        <w:spacing w:line="223" w:lineRule="auto"/>
         <w:rPr>
           <w:sz w:val="56"/>
         </w:rPr>
         <w:sectPr>
           <w:pgSz w:w="19200" w:h="10800" w:orient="landscape"/>
-          <w:pgMar w:top="940" w:bottom="280" w:left="425" w:right="141"/>
+          <w:pgMar w:top="940" w:right="141" w:bottom="280" w:left="425" w:header="720" w:footer="720" w:gutter="0"/>
+          <w:cols w:space="720"/>
         </w:sectPr>
       </w:pPr>
     </w:p>
@@ -763,23 +757,26 @@
       </w:pPr>
       <w:r>
         <w:rPr>
+          <w:noProof/>
           <w:sz w:val="20"/>
         </w:rPr>
+        <w:lastRenderedPageBreak/>
         <mc:AlternateContent>
           <mc:Choice Requires="wps">
             <w:drawing>
-              <wp:inline distT="0" distB="0" distL="0" distR="0">
+              <wp:inline distT="0" distB="0" distL="0" distR="0" wp14:anchorId="2C3C8694" wp14:editId="2903B947">
                 <wp:extent cx="11092815" cy="646430"/>
                 <wp:effectExtent l="9525" t="9525" r="3809" b="10795"/>
                 <wp:docPr id="2" name="Textbox 2"/>
                 <wp:cNvGraphicFramePr>
-                  <a:graphicFrameLocks/>
+                  <a:graphicFrameLocks xmlns:a="http://schemas.openxmlformats.org/drawingml/2006/main"/>
                 </wp:cNvGraphicFramePr>
-                <a:graphic>
+                <a:graphic xmlns:a="http://schemas.openxmlformats.org/drawingml/2006/main">
                   <a:graphicData uri="http://schemas.microsoft.com/office/word/2010/wordprocessingShape">
                     <wps:wsp>
-                      <wps:cNvPr id="2" name="Textbox 2"/>
-                      <wps:cNvSpPr txBox="1"/>
+                      <wps:cNvSpPr txBox="1">
+                        <a:spLocks/>
+                      </wps:cNvSpPr>
                       <wps:spPr>
                         <a:xfrm>
                           <a:off x="0" y="0"/>
@@ -800,17 +797,14 @@
                           <w:p>
                             <w:pPr>
                               <w:spacing w:before="50"/>
-                              <w:ind w:left="1" w:right="0" w:firstLine="0"/>
+                              <w:ind w:left="1"/>
                               <w:jc w:val="center"/>
                               <w:rPr>
                                 <w:sz w:val="36"/>
                               </w:rPr>
                             </w:pPr>
-                            <w:bookmarkStart w:name="Slide 3" w:id="3"/>
-                            <w:bookmarkEnd w:id="3"/>
-                            <w:r>
-                              <w:rPr/>
-                            </w:r>
+                            <w:bookmarkStart w:id="2" w:name="Slide_3"/>
+                            <w:bookmarkEnd w:id="2"/>
                             <w:r>
                               <w:rPr>
                                 <w:spacing w:val="-2"/>
@@ -837,7 +831,7 @@
                               <w:rPr>
                                 <w:spacing w:val="-32"/>
                               </w:rPr>
-                              <w:t> </w:t>
+                              <w:t xml:space="preserve"> </w:t>
                             </w:r>
                             <w:r>
                               <w:rPr>
@@ -849,7 +843,7 @@
                               <w:rPr>
                                 <w:spacing w:val="-26"/>
                               </w:rPr>
-                              <w:t> </w:t>
+                              <w:t xml:space="preserve"> </w:t>
                             </w:r>
                             <w:r>
                               <w:rPr>
@@ -861,7 +855,7 @@
                               <w:rPr>
                                 <w:spacing w:val="-28"/>
                               </w:rPr>
-                              <w:t> </w:t>
+                              <w:t xml:space="preserve"> </w:t>
                             </w:r>
                             <w:r>
                               <w:rPr>
@@ -873,7 +867,7 @@
                               <w:rPr>
                                 <w:spacing w:val="-25"/>
                               </w:rPr>
-                              <w:t> </w:t>
+                              <w:t xml:space="preserve"> </w:t>
                             </w:r>
                             <w:r>
                               <w:rPr>
@@ -885,7 +879,7 @@
                               <w:rPr>
                                 <w:spacing w:val="-24"/>
                               </w:rPr>
-                              <w:t> </w:t>
+                              <w:t xml:space="preserve"> </w:t>
                             </w:r>
                             <w:r>
                               <w:rPr>
@@ -907,28 +901,25 @@
           </mc:Choice>
           <mc:Fallback>
             <w:pict>
-              <v:shapetype id="_x0000_t202" o:spt="202" coordsize="21600,21600" path="m,l,21600r21600,l21600,xe">
+              <v:shapetype w14:anchorId="2C3C8694" id="_x0000_t202" coordsize="21600,21600" o:spt="202" path="m,l,21600r21600,l21600,xe">
                 <v:stroke joinstyle="miter"/>
                 <v:path gradientshapeok="t" o:connecttype="rect"/>
               </v:shapetype>
-              <v:shape style="width:873.45pt;height:50.9pt;mso-position-horizontal-relative:char;mso-position-vertical-relative:line" type="#_x0000_t202" id="docshape1" filled="false" stroked="true" strokeweight="1.5pt" strokecolor="#0e9ed4">
-                <w10:anchorlock/>
+              <v:shape id="Textbox 2" o:spid="_x0000_s1026" type="#_x0000_t202" style="width:873.45pt;height:50.9pt;visibility:visible;mso-wrap-style:square;mso-left-percent:-10001;mso-top-percent:-10001;mso-position-horizontal:absolute;mso-position-horizontal-relative:char;mso-position-vertical:absolute;mso-position-vertical-relative:line;mso-left-percent:-10001;mso-top-percent:-10001;v-text-anchor:top" o:gfxdata="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" filled="f" strokecolor="#0e9ed4" strokeweight="1.5pt">
+                <v:path arrowok="t"/>
                 <v:textbox inset="0,0,0,0">
                   <w:txbxContent>
                     <w:p>
                       <w:pPr>
                         <w:spacing w:before="50"/>
-                        <w:ind w:left="1" w:right="0" w:firstLine="0"/>
+                        <w:ind w:left="1"/>
                         <w:jc w:val="center"/>
                         <w:rPr>
                           <w:sz w:val="36"/>
                         </w:rPr>
                       </w:pPr>
-                      <w:bookmarkStart w:name="Slide 3" w:id="4"/>
-                      <w:bookmarkEnd w:id="4"/>
-                      <w:r>
-                        <w:rPr/>
-                      </w:r>
+                      <w:bookmarkStart w:id="3" w:name="Slide_3"/>
+                      <w:bookmarkEnd w:id="3"/>
                       <w:r>
                         <w:rPr>
                           <w:spacing w:val="-2"/>
@@ -955,7 +946,7 @@
                         <w:rPr>
                           <w:spacing w:val="-32"/>
                         </w:rPr>
-                        <w:t> </w:t>
+                        <w:t xml:space="preserve"> </w:t>
                       </w:r>
                       <w:r>
                         <w:rPr>
@@ -967,7 +958,7 @@
                         <w:rPr>
                           <w:spacing w:val="-26"/>
                         </w:rPr>
-                        <w:t> </w:t>
+                        <w:t xml:space="preserve"> </w:t>
                       </w:r>
                       <w:r>
                         <w:rPr>
@@ -979,7 +970,7 @@
                         <w:rPr>
                           <w:spacing w:val="-28"/>
                         </w:rPr>
-                        <w:t> </w:t>
+                        <w:t xml:space="preserve"> </w:t>
                       </w:r>
                       <w:r>
                         <w:rPr>
@@ -991,7 +982,7 @@
                         <w:rPr>
                           <w:spacing w:val="-25"/>
                         </w:rPr>
-                        <w:t> </w:t>
+                        <w:t xml:space="preserve"> </w:t>
                       </w:r>
                       <w:r>
                         <w:rPr>
@@ -1003,7 +994,7 @@
                         <w:rPr>
                           <w:spacing w:val="-24"/>
                         </w:rPr>
-                        <w:t> </w:t>
+                        <w:t xml:space="preserve"> </w:t>
                       </w:r>
                       <w:r>
                         <w:rPr>
@@ -1014,35 +1005,32 @@
                     </w:p>
                   </w:txbxContent>
                 </v:textbox>
-                <v:stroke dashstyle="solid"/>
+                <w10:anchorlock/>
               </v:shape>
             </w:pict>
           </mc:Fallback>
         </mc:AlternateContent>
       </w:r>
-      <w:r>
-        <w:rPr>
-          <w:sz w:val="20"/>
-        </w:rPr>
-      </w:r>
     </w:p>
     <w:p>
       <w:pPr>
         <w:spacing w:before="1675"/>
-        <w:ind w:left="0" w:right="281" w:firstLine="0"/>
+        <w:ind w:right="281"/>
         <w:jc w:val="center"/>
         <w:rPr>
-          <w:sz w:val="160"/>
+          <w:sz w:val="30"/>
+          <w:szCs w:val="30"/>
         </w:rPr>
       </w:pPr>
       <w:r>
         <w:rPr>
+          <w:noProof/>
           <w:sz w:val="160"/>
         </w:rPr>
         <mc:AlternateContent>
           <mc:Choice Requires="wps">
             <w:drawing>
-              <wp:anchor distT="0" distB="0" distL="0" distR="0" allowOverlap="1" layoutInCell="1" locked="0" behindDoc="1" simplePos="0" relativeHeight="487492096">
+              <wp:anchor distT="0" distB="0" distL="0" distR="0" simplePos="0" relativeHeight="487492096" behindDoc="1" locked="0" layoutInCell="1" allowOverlap="1" wp14:anchorId="0EE7A6A6" wp14:editId="67F0D737">
                 <wp:simplePos x="0" y="0"/>
                 <wp:positionH relativeFrom="page">
                   <wp:posOffset>549732</wp:posOffset>
@@ -1055,13 +1043,14 @@
                 <wp:wrapNone/>
                 <wp:docPr id="3" name="Graphic 3"/>
                 <wp:cNvGraphicFramePr>
-                  <a:graphicFrameLocks/>
+                  <a:graphicFrameLocks xmlns:a="http://schemas.openxmlformats.org/drawingml/2006/main"/>
                 </wp:cNvGraphicFramePr>
-                <a:graphic>
+                <a:graphic xmlns:a="http://schemas.openxmlformats.org/drawingml/2006/main">
                   <a:graphicData uri="http://schemas.microsoft.com/office/word/2010/wordprocessingShape">
                     <wps:wsp>
-                      <wps:cNvPr id="3" name="Graphic 3"/>
-                      <wps:cNvSpPr/>
+                      <wps:cNvSpPr>
+                        <a:spLocks/>
+                      </wps:cNvSpPr>
                       <wps:spPr>
                         <a:xfrm>
                           <a:off x="0" y="0"/>
@@ -1115,34 +1104,139 @@
           </mc:Choice>
           <mc:Fallback>
             <w:pict>
-              <v:rect style="position:absolute;margin-left:43.285999pt;margin-top:10.040pt;width:873.43pt;height:246.0pt;mso-position-horizontal-relative:page;mso-position-vertical-relative:paragraph;z-index:-15824384" id="docshape2" filled="false" stroked="true" strokeweight="1.5pt" strokecolor="#0e9ed4">
-                <v:stroke dashstyle="solid"/>
-                <w10:wrap type="none"/>
-              </v:rect>
+              <v:shape w14:anchorId="4D96BC3E" id="Graphic 3" o:spid="_x0000_s1026" style="position:absolute;margin-left:43.3pt;margin-top:10.05pt;width:873.45pt;height:246pt;z-index:-15824384;visibility:visible;mso-wrap-style:square;mso-wrap-distance-left:0;mso-wrap-distance-top:0;mso-wrap-distance-right:0;mso-wrap-distance-bottom:0;mso-position-horizontal:absolute;mso-position-horizontal-relative:page;mso-position-vertical:absolute;mso-position-vertical-relative:text;v-text-anchor:top" coordsize="11092815,3124200" o:gfxdata="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" path="m,3124200r11092560,l11092560,,,,,3124200xe" filled="f" strokecolor="#0e9ed4" strokeweight="1.5pt">
+                <v:path arrowok="t"/>
+                <w10:wrap anchorx="page"/>
+              </v:shape>
             </w:pict>
           </mc:Fallback>
         </mc:AlternateContent>
       </w:r>
       <w:r>
         <w:rPr>
-          <w:spacing w:val="-5"/>
-          <w:sz w:val="160"/>
-        </w:rPr>
-        <w:t>Welcome</w:t>
-      </w:r>
-      <w:r>
-        <w:rPr>
-          <w:spacing w:val="-144"/>
-          <w:sz w:val="160"/>
-        </w:rPr>
-        <w:t> </w:t>
-      </w:r>
-      <w:r>
-        <w:rPr>
-          <w:spacing w:val="-7"/>
-          <w:sz w:val="160"/>
-        </w:rPr>
-        <w:t>Paragraph</w:t>
+          <w:rFonts w:hint="cs"/>
+          <w:sz w:val="30"/>
+          <w:szCs w:val="30"/>
+        </w:rPr>
+        <w:t xml:space="preserve">Welcome to </w:t>
+      </w:r>
+      <w:r>
+        <w:rPr>
+          <w:rFonts w:hint="cs"/>
+          <w:b/>
+          <w:bCs/>
+          <w:sz w:val="30"/>
+          <w:szCs w:val="30"/>
+        </w:rPr>
+        <w:t>JustDane Homebrew</w:t>
+      </w:r>
+      <w:r>
+        <w:rPr>
+          <w:rFonts w:hint="cs"/>
+          <w:sz w:val="30"/>
+          <w:szCs w:val="30"/>
+        </w:rPr>
+        <w:t xml:space="preserve">, a curated collection of original creations and fan-made adaptations designed to enrich your tabletop adventures. Here you’ll find a growing library of monsters, items, races, classes, and full campaign worlds—each clearly labeled as </w:t>
+      </w:r>
+      <w:r>
+        <w:rPr>
+          <w:rFonts w:hint="cs"/>
+          <w:b/>
+          <w:bCs/>
+          <w:sz w:val="30"/>
+          <w:szCs w:val="30"/>
+        </w:rPr>
+        <w:t>Original</w:t>
+      </w:r>
+      <w:r>
+        <w:rPr>
+          <w:rFonts w:hint="cs"/>
+          <w:sz w:val="30"/>
+          <w:szCs w:val="30"/>
+        </w:rPr>
+        <w:t xml:space="preserve"> or </w:t>
+      </w:r>
+      <w:proofErr w:type="gramStart"/>
+      <w:r>
+        <w:rPr>
+          <w:rFonts w:hint="cs"/>
+          <w:b/>
+          <w:bCs/>
+          <w:sz w:val="30"/>
+          <w:szCs w:val="30"/>
+        </w:rPr>
+        <w:t>Adaptation</w:t>
+      </w:r>
+      <w:r>
+        <w:rPr>
+          <w:rFonts w:hint="cs"/>
+          <w:sz w:val="30"/>
+          <w:szCs w:val="30"/>
+        </w:rPr>
+        <w:t>, and</w:t>
+      </w:r>
+      <w:proofErr w:type="gramEnd"/>
+      <w:r>
+        <w:rPr>
+          <w:rFonts w:hint="cs"/>
+          <w:sz w:val="30"/>
+          <w:szCs w:val="30"/>
+        </w:rPr>
+        <w:t xml:space="preserve"> marked </w:t>
+      </w:r>
+      <w:r>
+        <w:rPr>
+          <w:rFonts w:hint="cs"/>
+          <w:b/>
+          <w:bCs/>
+          <w:sz w:val="30"/>
+          <w:szCs w:val="30"/>
+        </w:rPr>
+        <w:t>Ready</w:t>
+      </w:r>
+      <w:r>
+        <w:rPr>
+          <w:rFonts w:hint="cs"/>
+          <w:sz w:val="30"/>
+          <w:szCs w:val="30"/>
+        </w:rPr>
+        <w:t xml:space="preserve"> or </w:t>
+      </w:r>
+      <w:r>
+        <w:rPr>
+          <w:rFonts w:hint="cs"/>
+          <w:b/>
+          <w:bCs/>
+          <w:sz w:val="30"/>
+          <w:szCs w:val="30"/>
+        </w:rPr>
+        <w:t>WIP</w:t>
+      </w:r>
+      <w:r>
+        <w:rPr>
+          <w:rFonts w:hint="cs"/>
+          <w:sz w:val="30"/>
+          <w:szCs w:val="30"/>
+        </w:rPr>
+        <w:t xml:space="preserve"> so you always know what’s polished and what’s still evolving. Whether you’re a Dungeon Master looking for new encounters or a player searching for fresh character options, this site offers a clean, organized, and immersive way to explore </w:t>
+      </w:r>
+      <w:proofErr w:type="gramStart"/>
+      <w:r>
+        <w:rPr>
+          <w:rFonts w:hint="cs"/>
+          <w:sz w:val="30"/>
+          <w:szCs w:val="30"/>
+        </w:rPr>
+        <w:t>all of</w:t>
+      </w:r>
+      <w:proofErr w:type="gramEnd"/>
+      <w:r>
+        <w:rPr>
+          <w:rFonts w:hint="cs"/>
+          <w:sz w:val="30"/>
+          <w:szCs w:val="30"/>
+        </w:rPr>
+        <w:t xml:space="preserve"> my D&amp;D content in one place.</w:t>
       </w:r>
     </w:p>
     <w:p>
@@ -1211,12 +1305,13 @@
       </w:pPr>
       <w:r>
         <w:rPr>
+          <w:noProof/>
           <w:sz w:val="20"/>
         </w:rPr>
         <mc:AlternateContent>
           <mc:Choice Requires="wps">
             <w:drawing>
-              <wp:anchor distT="0" distB="0" distL="0" distR="0" allowOverlap="1" layoutInCell="1" locked="0" behindDoc="1" simplePos="0" relativeHeight="487588864">
+              <wp:anchor distT="0" distB="0" distL="0" distR="0" simplePos="0" relativeHeight="487588864" behindDoc="1" locked="0" layoutInCell="1" allowOverlap="1" wp14:anchorId="1D7D3991" wp14:editId="68162852">
                 <wp:simplePos x="0" y="0"/>
                 <wp:positionH relativeFrom="page">
                   <wp:posOffset>522516</wp:posOffset>
@@ -1229,13 +1324,14 @@
                 <wp:wrapTopAndBottom/>
                 <wp:docPr id="4" name="Textbox 4"/>
                 <wp:cNvGraphicFramePr>
-                  <a:graphicFrameLocks/>
+                  <a:graphicFrameLocks xmlns:a="http://schemas.openxmlformats.org/drawingml/2006/main"/>
                 </wp:cNvGraphicFramePr>
-                <a:graphic>
+                <a:graphic xmlns:a="http://schemas.openxmlformats.org/drawingml/2006/main">
                   <a:graphicData uri="http://schemas.microsoft.com/office/word/2010/wordprocessingShape">
                     <wps:wsp>
-                      <wps:cNvPr id="4" name="Textbox 4"/>
-                      <wps:cNvSpPr txBox="1"/>
+                      <wps:cNvSpPr txBox="1">
+                        <a:spLocks/>
+                      </wps:cNvSpPr>
                       <wps:spPr>
                         <a:xfrm>
                           <a:off x="0" y="0"/>
@@ -1281,7 +1377,7 @@
                               <w:rPr>
                                 <w:spacing w:val="-36"/>
                               </w:rPr>
-                              <w:t> </w:t>
+                              <w:t xml:space="preserve"> </w:t>
                             </w:r>
                             <w:r>
                               <w:rPr>
@@ -1293,7 +1389,7 @@
                               <w:rPr>
                                 <w:spacing w:val="-35"/>
                               </w:rPr>
-                              <w:t> </w:t>
+                              <w:t xml:space="preserve"> </w:t>
                             </w:r>
                             <w:r>
                               <w:rPr>
@@ -1305,7 +1401,7 @@
                               <w:rPr>
                                 <w:spacing w:val="-38"/>
                               </w:rPr>
-                              <w:t> </w:t>
+                              <w:t xml:space="preserve"> </w:t>
                             </w:r>
                             <w:r>
                               <w:rPr>
@@ -1317,7 +1413,7 @@
                               <w:rPr>
                                 <w:spacing w:val="-33"/>
                               </w:rPr>
-                              <w:t> </w:t>
+                              <w:t xml:space="preserve"> </w:t>
                             </w:r>
                             <w:r>
                               <w:rPr>
@@ -1329,7 +1425,7 @@
                               <w:rPr>
                                 <w:spacing w:val="-38"/>
                               </w:rPr>
-                              <w:t> </w:t>
+                              <w:t xml:space="preserve"> </w:t>
                             </w:r>
                             <w:r>
                               <w:rPr>
@@ -1341,7 +1437,7 @@
                               <w:rPr>
                                 <w:spacing w:val="-35"/>
                               </w:rPr>
-                              <w:t> </w:t>
+                              <w:t xml:space="preserve"> </w:t>
                             </w:r>
                             <w:r>
                               <w:rPr>
@@ -1353,7 +1449,7 @@
                               <w:rPr>
                                 <w:spacing w:val="-39"/>
                               </w:rPr>
-                              <w:t> </w:t>
+                              <w:t xml:space="preserve"> </w:t>
                             </w:r>
                             <w:r>
                               <w:rPr>
@@ -1365,7 +1461,7 @@
                               <w:rPr>
                                 <w:spacing w:val="-35"/>
                               </w:rPr>
-                              <w:t> </w:t>
+                              <w:t xml:space="preserve"> </w:t>
                             </w:r>
                             <w:r>
                               <w:rPr>
@@ -1377,7 +1473,7 @@
                               <w:rPr>
                                 <w:spacing w:val="-38"/>
                               </w:rPr>
-                              <w:t> </w:t>
+                              <w:t xml:space="preserve"> </w:t>
                             </w:r>
                             <w:r>
                               <w:rPr>
@@ -1389,7 +1485,7 @@
                               <w:rPr>
                                 <w:spacing w:val="-34"/>
                               </w:rPr>
-                              <w:t> </w:t>
+                              <w:t xml:space="preserve"> </w:t>
                             </w:r>
                             <w:r>
                               <w:rPr>
@@ -1401,7 +1497,7 @@
                               <w:rPr>
                                 <w:spacing w:val="-38"/>
                               </w:rPr>
-                              <w:t> </w:t>
+                              <w:t xml:space="preserve"> </w:t>
                             </w:r>
                             <w:r>
                               <w:rPr>
@@ -1413,7 +1509,7 @@
                               <w:rPr>
                                 <w:spacing w:val="-33"/>
                               </w:rPr>
-                              <w:t> </w:t>
+                              <w:t xml:space="preserve"> </w:t>
                             </w:r>
                             <w:r>
                               <w:rPr>
@@ -1425,7 +1521,7 @@
                               <w:rPr>
                                 <w:spacing w:val="-36"/>
                               </w:rPr>
-                              <w:t> </w:t>
+                              <w:t xml:space="preserve"> </w:t>
                             </w:r>
                             <w:r>
                               <w:rPr>
@@ -1447,7 +1543,8 @@
           </mc:Choice>
           <mc:Fallback>
             <w:pict>
-              <v:shape style="position:absolute;margin-left:41.143002pt;margin-top:14.401078pt;width:882.9pt;height:132pt;mso-position-horizontal-relative:page;mso-position-vertical-relative:paragraph;z-index:-15727616;mso-wrap-distance-left:0;mso-wrap-distance-right:0" type="#_x0000_t202" id="docshape3" filled="false" stroked="true" strokeweight="1.5pt" strokecolor="#0e9ed4">
+              <v:shape w14:anchorId="1D7D3991" id="Textbox 4" o:spid="_x0000_s1027" type="#_x0000_t202" style="position:absolute;margin-left:41.15pt;margin-top:14.4pt;width:882.9pt;height:132pt;z-index:-15727616;visibility:visible;mso-wrap-style:square;mso-wrap-distance-left:0;mso-wrap-distance-top:0;mso-wrap-distance-right:0;mso-wrap-distance-bottom:0;mso-position-horizontal:absolute;mso-position-horizontal-relative:page;mso-position-vertical:absolute;mso-position-vertical-relative:text;v-text-anchor:top" o:gfxdata="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" filled="f" strokecolor="#0e9ed4" strokeweight="1.5pt">
+                <v:path arrowok="t"/>
                 <v:textbox inset="0,0,0,0">
                   <w:txbxContent>
                     <w:p>
@@ -1478,7 +1575,7 @@
                         <w:rPr>
                           <w:spacing w:val="-36"/>
                         </w:rPr>
-                        <w:t> </w:t>
+                        <w:t xml:space="preserve"> </w:t>
                       </w:r>
                       <w:r>
                         <w:rPr>
@@ -1490,7 +1587,7 @@
                         <w:rPr>
                           <w:spacing w:val="-35"/>
                         </w:rPr>
-                        <w:t> </w:t>
+                        <w:t xml:space="preserve"> </w:t>
                       </w:r>
                       <w:r>
                         <w:rPr>
@@ -1502,7 +1599,7 @@
                         <w:rPr>
                           <w:spacing w:val="-38"/>
                         </w:rPr>
-                        <w:t> </w:t>
+                        <w:t xml:space="preserve"> </w:t>
                       </w:r>
                       <w:r>
                         <w:rPr>
@@ -1514,7 +1611,7 @@
                         <w:rPr>
                           <w:spacing w:val="-33"/>
                         </w:rPr>
-                        <w:t> </w:t>
+                        <w:t xml:space="preserve"> </w:t>
                       </w:r>
                       <w:r>
                         <w:rPr>
@@ -1526,7 +1623,7 @@
                         <w:rPr>
                           <w:spacing w:val="-38"/>
                         </w:rPr>
-                        <w:t> </w:t>
+                        <w:t xml:space="preserve"> </w:t>
                       </w:r>
                       <w:r>
                         <w:rPr>
@@ -1538,7 +1635,7 @@
                         <w:rPr>
                           <w:spacing w:val="-35"/>
                         </w:rPr>
-                        <w:t> </w:t>
+                        <w:t xml:space="preserve"> </w:t>
                       </w:r>
                       <w:r>
                         <w:rPr>
@@ -1550,7 +1647,7 @@
                         <w:rPr>
                           <w:spacing w:val="-39"/>
                         </w:rPr>
-                        <w:t> </w:t>
+                        <w:t xml:space="preserve"> </w:t>
                       </w:r>
                       <w:r>
                         <w:rPr>
@@ -1562,7 +1659,7 @@
                         <w:rPr>
                           <w:spacing w:val="-35"/>
                         </w:rPr>
-                        <w:t> </w:t>
+                        <w:t xml:space="preserve"> </w:t>
                       </w:r>
                       <w:r>
                         <w:rPr>
@@ -1574,7 +1671,7 @@
                         <w:rPr>
                           <w:spacing w:val="-38"/>
                         </w:rPr>
-                        <w:t> </w:t>
+                        <w:t xml:space="preserve"> </w:t>
                       </w:r>
                       <w:r>
                         <w:rPr>
@@ -1586,7 +1683,7 @@
                         <w:rPr>
                           <w:spacing w:val="-34"/>
                         </w:rPr>
-                        <w:t> </w:t>
+                        <w:t xml:space="preserve"> </w:t>
                       </w:r>
                       <w:r>
                         <w:rPr>
@@ -1598,7 +1695,7 @@
                         <w:rPr>
                           <w:spacing w:val="-38"/>
                         </w:rPr>
-                        <w:t> </w:t>
+                        <w:t xml:space="preserve"> </w:t>
                       </w:r>
                       <w:r>
                         <w:rPr>
@@ -1610,7 +1707,7 @@
                         <w:rPr>
                           <w:spacing w:val="-33"/>
                         </w:rPr>
-                        <w:t> </w:t>
+                        <w:t xml:space="preserve"> </w:t>
                       </w:r>
                       <w:r>
                         <w:rPr>
@@ -1622,7 +1719,7 @@
                         <w:rPr>
                           <w:spacing w:val="-36"/>
                         </w:rPr>
-                        <w:t> </w:t>
+                        <w:t xml:space="preserve"> </w:t>
                       </w:r>
                       <w:r>
                         <w:rPr>
@@ -1633,8 +1730,7 @@
                     </w:p>
                   </w:txbxContent>
                 </v:textbox>
-                <v:stroke dashstyle="solid"/>
-                <w10:wrap type="topAndBottom"/>
+                <w10:wrap type="topAndBottom" anchorx="page"/>
               </v:shape>
             </w:pict>
           </mc:Fallback>
@@ -1642,12 +1738,13 @@
       </w:r>
       <w:r>
         <w:rPr>
+          <w:noProof/>
           <w:sz w:val="20"/>
         </w:rPr>
         <mc:AlternateContent>
           <mc:Choice Requires="wps">
             <w:drawing>
-              <wp:anchor distT="0" distB="0" distL="0" distR="0" allowOverlap="1" layoutInCell="1" locked="0" behindDoc="1" simplePos="0" relativeHeight="487589376">
+              <wp:anchor distT="0" distB="0" distL="0" distR="0" simplePos="0" relativeHeight="487589376" behindDoc="1" locked="0" layoutInCell="1" allowOverlap="1" wp14:anchorId="3515B7EB" wp14:editId="1D3D7BF4">
                 <wp:simplePos x="0" y="0"/>
                 <wp:positionH relativeFrom="page">
                   <wp:posOffset>549732</wp:posOffset>
@@ -1660,13 +1757,14 @@
                 <wp:wrapTopAndBottom/>
                 <wp:docPr id="5" name="Textbox 5"/>
                 <wp:cNvGraphicFramePr>
-                  <a:graphicFrameLocks/>
+                  <a:graphicFrameLocks xmlns:a="http://schemas.openxmlformats.org/drawingml/2006/main"/>
                 </wp:cNvGraphicFramePr>
-                <a:graphic>
+                <a:graphic xmlns:a="http://schemas.openxmlformats.org/drawingml/2006/main">
                   <a:graphicData uri="http://schemas.microsoft.com/office/word/2010/wordprocessingShape">
                     <wps:wsp>
-                      <wps:cNvPr id="5" name="Textbox 5"/>
-                      <wps:cNvSpPr txBox="1"/>
+                      <wps:cNvSpPr txBox="1">
+                        <a:spLocks/>
+                      </wps:cNvSpPr>
                       <wps:spPr>
                         <a:xfrm>
                           <a:off x="0" y="0"/>
@@ -1701,7 +1799,7 @@
                               <w:rPr>
                                 <w:spacing w:val="-25"/>
                               </w:rPr>
-                              <w:t> </w:t>
+                              <w:t xml:space="preserve"> </w:t>
                             </w:r>
                             <w:r>
                               <w:rPr>
@@ -1713,7 +1811,7 @@
                               <w:rPr>
                                 <w:spacing w:val="-21"/>
                               </w:rPr>
-                              <w:t> </w:t>
+                              <w:t xml:space="preserve"> </w:t>
                             </w:r>
                             <w:r>
                               <w:rPr>
@@ -1725,7 +1823,7 @@
                               <w:rPr>
                                 <w:spacing w:val="-31"/>
                               </w:rPr>
-                              <w:t> </w:t>
+                              <w:t xml:space="preserve"> </w:t>
                             </w:r>
                             <w:r>
                               <w:rPr>
@@ -1747,7 +1845,8 @@
           </mc:Choice>
           <mc:Fallback>
             <w:pict>
-              <v:shape style="position:absolute;margin-left:43.285999pt;margin-top:159.258881pt;width:882.9pt;height:25.75pt;mso-position-horizontal-relative:page;mso-position-vertical-relative:paragraph;z-index:-15727104;mso-wrap-distance-left:0;mso-wrap-distance-right:0" type="#_x0000_t202" id="docshape4" filled="false" stroked="true" strokeweight="1.5pt" strokecolor="#0e9ed4">
+              <v:shape w14:anchorId="3515B7EB" id="Textbox 5" o:spid="_x0000_s1028" type="#_x0000_t202" style="position:absolute;margin-left:43.3pt;margin-top:159.25pt;width:882.9pt;height:25.75pt;z-index:-15727104;visibility:visible;mso-wrap-style:square;mso-wrap-distance-left:0;mso-wrap-distance-top:0;mso-wrap-distance-right:0;mso-wrap-distance-bottom:0;mso-position-horizontal:absolute;mso-position-horizontal-relative:page;mso-position-vertical:absolute;mso-position-vertical-relative:text;v-text-anchor:top" o:gfxdata="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" filled="f" strokecolor="#0e9ed4" strokeweight="1.5pt">
+                <v:path arrowok="t"/>
                 <v:textbox inset="0,0,0,0">
                   <w:txbxContent>
                     <w:p>
@@ -1767,7 +1866,7 @@
                         <w:rPr>
                           <w:spacing w:val="-25"/>
                         </w:rPr>
-                        <w:t> </w:t>
+                        <w:t xml:space="preserve"> </w:t>
                       </w:r>
                       <w:r>
                         <w:rPr>
@@ -1779,7 +1878,7 @@
                         <w:rPr>
                           <w:spacing w:val="-21"/>
                         </w:rPr>
-                        <w:t> </w:t>
+                        <w:t xml:space="preserve"> </w:t>
                       </w:r>
                       <w:r>
                         <w:rPr>
@@ -1791,7 +1890,7 @@
                         <w:rPr>
                           <w:spacing w:val="-31"/>
                         </w:rPr>
-                        <w:t> </w:t>
+                        <w:t xml:space="preserve"> </w:t>
                       </w:r>
                       <w:r>
                         <w:rPr>
@@ -1802,8 +1901,7 @@
                     </w:p>
                   </w:txbxContent>
                 </v:textbox>
-                <v:stroke dashstyle="solid"/>
-                <w10:wrap type="topAndBottom"/>
+                <w10:wrap type="topAndBottom" anchorx="page"/>
               </v:shape>
             </w:pict>
           </mc:Fallback>
@@ -1822,13 +1920,13 @@
     <w:p>
       <w:pPr>
         <w:pStyle w:val="BodyText"/>
-        <w:spacing w:after="0"/>
         <w:rPr>
           <w:sz w:val="18"/>
         </w:rPr>
         <w:sectPr>
           <w:pgSz w:w="19200" w:h="10800" w:orient="landscape"/>
-          <w:pgMar w:top="740" w:bottom="0" w:left="425" w:right="141"/>
+          <w:pgMar w:top="740" w:right="141" w:bottom="0" w:left="425" w:header="720" w:footer="720" w:gutter="0"/>
+          <w:cols w:space="720"/>
         </w:sectPr>
       </w:pPr>
     </w:p>
@@ -1841,12 +1939,14 @@
       </w:pPr>
       <w:r>
         <w:rPr>
+          <w:noProof/>
           <w:sz w:val="20"/>
         </w:rPr>
+        <w:lastRenderedPageBreak/>
         <mc:AlternateContent>
           <mc:Choice Requires="wps">
             <w:drawing>
-              <wp:anchor distT="0" distB="0" distL="0" distR="0" allowOverlap="1" layoutInCell="1" locked="0" behindDoc="0" simplePos="0" relativeHeight="15732736">
+              <wp:anchor distT="0" distB="0" distL="0" distR="0" simplePos="0" relativeHeight="15732736" behindDoc="0" locked="0" layoutInCell="1" allowOverlap="1" wp14:anchorId="5AC9015A" wp14:editId="6C45BEFF">
                 <wp:simplePos x="0" y="0"/>
                 <wp:positionH relativeFrom="page">
                   <wp:posOffset>293916</wp:posOffset>
@@ -1859,13 +1959,14 @@
                 <wp:wrapNone/>
                 <wp:docPr id="6" name="Textbox 6"/>
                 <wp:cNvGraphicFramePr>
-                  <a:graphicFrameLocks/>
+                  <a:graphicFrameLocks xmlns:a="http://schemas.openxmlformats.org/drawingml/2006/main"/>
                 </wp:cNvGraphicFramePr>
-                <a:graphic>
+                <a:graphic xmlns:a="http://schemas.openxmlformats.org/drawingml/2006/main">
                   <a:graphicData uri="http://schemas.microsoft.com/office/word/2010/wordprocessingShape">
                     <wps:wsp>
-                      <wps:cNvPr id="6" name="Textbox 6"/>
-                      <wps:cNvSpPr txBox="1"/>
+                      <wps:cNvSpPr txBox="1">
+                        <a:spLocks/>
+                      </wps:cNvSpPr>
                       <wps:spPr>
                         <a:xfrm>
                           <a:off x="0" y="0"/>
@@ -1891,44 +1992,40 @@
                               <w:jc w:val="center"/>
                             </w:pPr>
                             <w:r>
-                              <w:rPr/>
                               <w:t>Header</w:t>
                             </w:r>
                             <w:r>
                               <w:rPr>
                                 <w:spacing w:val="-26"/>
                               </w:rPr>
-                              <w:t> </w:t>
-                            </w:r>
-                            <w:r>
-                              <w:rPr/>
+                              <w:t xml:space="preserve"> </w:t>
+                            </w:r>
+                            <w:r>
                               <w:t>(Same</w:t>
                             </w:r>
                             <w:r>
                               <w:rPr>
                                 <w:spacing w:val="-26"/>
                               </w:rPr>
-                              <w:t> </w:t>
-                            </w:r>
-                            <w:r>
-                              <w:rPr/>
+                              <w:t xml:space="preserve"> </w:t>
+                            </w:r>
+                            <w:r>
                               <w:t>as</w:t>
                             </w:r>
                             <w:r>
                               <w:rPr>
                                 <w:spacing w:val="-24"/>
                               </w:rPr>
-                              <w:t> </w:t>
-                            </w:r>
-                            <w:r>
-                              <w:rPr/>
+                              <w:t xml:space="preserve"> </w:t>
+                            </w:r>
+                            <w:r>
                               <w:t>Home</w:t>
                             </w:r>
                             <w:r>
                               <w:rPr>
                                 <w:spacing w:val="-26"/>
                               </w:rPr>
-                              <w:t> </w:t>
+                              <w:t xml:space="preserve"> </w:t>
                             </w:r>
                             <w:r>
                               <w:rPr>
@@ -1950,7 +2047,8 @@
           </mc:Choice>
           <mc:Fallback>
             <w:pict>
-              <v:shape style="position:absolute;margin-left:23.143pt;margin-top:20.573999pt;width:924pt;height:46.3pt;mso-position-horizontal-relative:page;mso-position-vertical-relative:page;z-index:15732736" type="#_x0000_t202" id="docshape5" filled="false" stroked="true" strokeweight="1.5pt" strokecolor="#0e9ed4">
+              <v:shape w14:anchorId="5AC9015A" id="Textbox 6" o:spid="_x0000_s1029" type="#_x0000_t202" style="position:absolute;margin-left:23.15pt;margin-top:20.55pt;width:924pt;height:46.3pt;z-index:15732736;visibility:visible;mso-wrap-style:square;mso-wrap-distance-left:0;mso-wrap-distance-top:0;mso-wrap-distance-right:0;mso-wrap-distance-bottom:0;mso-position-horizontal:absolute;mso-position-horizontal-relative:page;mso-position-vertical:absolute;mso-position-vertical-relative:page;v-text-anchor:top" o:gfxdata="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" filled="f" strokecolor="#0e9ed4" strokeweight="1.5pt">
+                <v:path arrowok="t"/>
                 <v:textbox inset="0,0,0,0">
                   <w:txbxContent>
                     <w:p>
@@ -1961,44 +2059,40 @@
                         <w:jc w:val="center"/>
                       </w:pPr>
                       <w:r>
-                        <w:rPr/>
                         <w:t>Header</w:t>
                       </w:r>
                       <w:r>
                         <w:rPr>
                           <w:spacing w:val="-26"/>
                         </w:rPr>
-                        <w:t> </w:t>
-                      </w:r>
-                      <w:r>
-                        <w:rPr/>
+                        <w:t xml:space="preserve"> </w:t>
+                      </w:r>
+                      <w:r>
                         <w:t>(Same</w:t>
                       </w:r>
                       <w:r>
                         <w:rPr>
                           <w:spacing w:val="-26"/>
                         </w:rPr>
-                        <w:t> </w:t>
-                      </w:r>
-                      <w:r>
-                        <w:rPr/>
+                        <w:t xml:space="preserve"> </w:t>
+                      </w:r>
+                      <w:r>
                         <w:t>as</w:t>
                       </w:r>
                       <w:r>
                         <w:rPr>
                           <w:spacing w:val="-24"/>
                         </w:rPr>
-                        <w:t> </w:t>
-                      </w:r>
-                      <w:r>
-                        <w:rPr/>
+                        <w:t xml:space="preserve"> </w:t>
+                      </w:r>
+                      <w:r>
                         <w:t>Home</w:t>
                       </w:r>
                       <w:r>
                         <w:rPr>
                           <w:spacing w:val="-26"/>
                         </w:rPr>
-                        <w:t> </w:t>
+                        <w:t xml:space="preserve"> </w:t>
                       </w:r>
                       <w:r>
                         <w:rPr>
@@ -2009,8 +2103,7 @@
                     </w:p>
                   </w:txbxContent>
                 </v:textbox>
-                <v:stroke dashstyle="solid"/>
-                <w10:wrap type="none"/>
+                <w10:wrap anchorx="page" anchory="page"/>
               </v:shape>
             </w:pict>
           </mc:Fallback>
@@ -2061,35 +2154,35 @@
     <w:p>
       <w:pPr>
         <w:tabs>
-          <w:tab w:pos="6451" w:val="left" w:leader="none"/>
-          <w:tab w:pos="12725" w:val="left" w:leader="none"/>
+          <w:tab w:val="left" w:pos="6451"/>
+          <w:tab w:val="left" w:pos="12725"/>
         </w:tabs>
-        <w:spacing w:line="240" w:lineRule="auto"/>
-        <w:ind w:left="177" w:right="0" w:firstLine="0"/>
-        <w:jc w:val="left"/>
+        <w:ind w:left="177"/>
         <w:rPr>
           <w:sz w:val="20"/>
         </w:rPr>
       </w:pPr>
       <w:r>
         <w:rPr>
+          <w:noProof/>
           <w:sz w:val="20"/>
         </w:rPr>
         <mc:AlternateContent>
           <mc:Choice Requires="wps">
             <w:drawing>
-              <wp:inline distT="0" distB="0" distL="0" distR="0">
+              <wp:inline distT="0" distB="0" distL="0" distR="0" wp14:anchorId="4ABD2CA7" wp14:editId="5666F1C9">
                 <wp:extent cx="3636010" cy="2569210"/>
                 <wp:effectExtent l="9525" t="9525" r="2539" b="12064"/>
                 <wp:docPr id="7" name="Textbox 7"/>
                 <wp:cNvGraphicFramePr>
-                  <a:graphicFrameLocks/>
+                  <a:graphicFrameLocks xmlns:a="http://schemas.openxmlformats.org/drawingml/2006/main"/>
                 </wp:cNvGraphicFramePr>
-                <a:graphic>
+                <a:graphic xmlns:a="http://schemas.openxmlformats.org/drawingml/2006/main">
                   <a:graphicData uri="http://schemas.microsoft.com/office/word/2010/wordprocessingShape">
                     <wps:wsp>
-                      <wps:cNvPr id="7" name="Textbox 7"/>
-                      <wps:cNvSpPr txBox="1"/>
+                      <wps:cNvSpPr txBox="1">
+                        <a:spLocks/>
+                      </wps:cNvSpPr>
                       <wps:spPr>
                         <a:xfrm>
                           <a:off x="0" y="0"/>
@@ -2128,13 +2221,8 @@
                                 <w:color w:val="000000"/>
                               </w:rPr>
                             </w:pPr>
-                            <w:bookmarkStart w:name="Slide 4" w:id="5"/>
-                            <w:bookmarkEnd w:id="5"/>
-                            <w:r>
-                              <w:rPr>
-                                <w:color w:val="000000"/>
-                              </w:rPr>
-                            </w:r>
+                            <w:bookmarkStart w:id="4" w:name="Slide_4"/>
+                            <w:bookmarkEnd w:id="4"/>
                             <w:r>
                               <w:rPr>
                                 <w:color w:val="FFFFFF"/>
@@ -2147,7 +2235,7 @@
                                 <w:color w:val="FFFFFF"/>
                                 <w:spacing w:val="-32"/>
                               </w:rPr>
-                              <w:t> </w:t>
+                              <w:t xml:space="preserve"> </w:t>
                             </w:r>
                             <w:r>
                               <w:rPr>
@@ -2161,7 +2249,7 @@
                                 <w:color w:val="FFFFFF"/>
                                 <w:spacing w:val="-32"/>
                               </w:rPr>
-                              <w:t> </w:t>
+                              <w:t xml:space="preserve"> </w:t>
                             </w:r>
                             <w:r>
                               <w:rPr>
@@ -2175,7 +2263,7 @@
                                 <w:color w:val="FFFFFF"/>
                                 <w:spacing w:val="-35"/>
                               </w:rPr>
-                              <w:t> </w:t>
+                              <w:t xml:space="preserve"> </w:t>
                             </w:r>
                             <w:r>
                               <w:rPr>
@@ -2189,7 +2277,7 @@
                                 <w:color w:val="FFFFFF"/>
                                 <w:spacing w:val="-28"/>
                               </w:rPr>
-                              <w:t> </w:t>
+                              <w:t xml:space="preserve"> </w:t>
                             </w:r>
                             <w:r>
                               <w:rPr>
@@ -2203,7 +2291,7 @@
                                 <w:color w:val="FFFFFF"/>
                                 <w:spacing w:val="-30"/>
                               </w:rPr>
-                              <w:t> </w:t>
+                              <w:t xml:space="preserve"> </w:t>
                             </w:r>
                             <w:r>
                               <w:rPr>
@@ -2252,7 +2340,7 @@
                                 <w:color w:val="FFFFFF"/>
                                 <w:spacing w:val="-38"/>
                               </w:rPr>
-                              <w:t> </w:t>
+                              <w:t xml:space="preserve"> </w:t>
                             </w:r>
                             <w:r>
                               <w:rPr>
@@ -2266,7 +2354,7 @@
                                 <w:color w:val="FFFFFF"/>
                                 <w:spacing w:val="-32"/>
                               </w:rPr>
-                              <w:t> </w:t>
+                              <w:t xml:space="preserve"> </w:t>
                             </w:r>
                             <w:r>
                               <w:rPr>
@@ -2280,14 +2368,14 @@
                                 <w:color w:val="FFFFFF"/>
                                 <w:spacing w:val="-38"/>
                               </w:rPr>
-                              <w:t> </w:t>
+                              <w:t xml:space="preserve"> </w:t>
                             </w:r>
                             <w:r>
                               <w:rPr>
                                 <w:color w:val="FFFFFF"/>
                                 <w:spacing w:val="-8"/>
                               </w:rPr>
-                              <w:t>Thing </w:t>
+                              <w:t xml:space="preserve">Thing </w:t>
                             </w:r>
                             <w:r>
                               <w:rPr>
@@ -2327,7 +2415,7 @@
                                 <w:color w:val="FFFFFF"/>
                                 <w:spacing w:val="-36"/>
                               </w:rPr>
-                              <w:t> </w:t>
+                              <w:t xml:space="preserve"> </w:t>
                             </w:r>
                             <w:r>
                               <w:rPr>
@@ -2341,7 +2429,7 @@
                                 <w:color w:val="FFFFFF"/>
                                 <w:spacing w:val="-16"/>
                               </w:rPr>
-                              <w:t> </w:t>
+                              <w:t xml:space="preserve"> </w:t>
                             </w:r>
                             <w:r>
                               <w:rPr>
@@ -2364,8 +2452,8 @@
           </mc:Choice>
           <mc:Fallback>
             <w:pict>
-              <v:shape style="width:286.3pt;height:202.3pt;mso-position-horizontal-relative:char;mso-position-vertical-relative:line" type="#_x0000_t202" id="docshape6" filled="true" fillcolor="#155f82" stroked="true" strokeweight="1.5pt" strokecolor="#042333">
-                <w10:anchorlock/>
+              <v:shape w14:anchorId="4ABD2CA7" id="Textbox 7" o:spid="_x0000_s1030" type="#_x0000_t202" style="width:286.3pt;height:202.3pt;visibility:visible;mso-wrap-style:square;mso-left-percent:-10001;mso-top-percent:-10001;mso-position-horizontal:absolute;mso-position-horizontal-relative:char;mso-position-vertical:absolute;mso-position-vertical-relative:line;mso-left-percent:-10001;mso-top-percent:-10001;v-text-anchor:top" o:gfxdata="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" fillcolor="#155f82" strokecolor="#042333" strokeweight="1.5pt">
+                <v:path arrowok="t"/>
                 <v:textbox inset="0,0,0,0">
                   <w:txbxContent>
                     <w:p>
@@ -2386,13 +2474,8 @@
                           <w:color w:val="000000"/>
                         </w:rPr>
                       </w:pPr>
-                      <w:bookmarkStart w:name="Slide 4" w:id="6"/>
-                      <w:bookmarkEnd w:id="6"/>
-                      <w:r>
-                        <w:rPr>
-                          <w:color w:val="000000"/>
-                        </w:rPr>
-                      </w:r>
+                      <w:bookmarkStart w:id="5" w:name="Slide_4"/>
+                      <w:bookmarkEnd w:id="5"/>
                       <w:r>
                         <w:rPr>
                           <w:color w:val="FFFFFF"/>
@@ -2405,7 +2488,7 @@
                           <w:color w:val="FFFFFF"/>
                           <w:spacing w:val="-32"/>
                         </w:rPr>
-                        <w:t> </w:t>
+                        <w:t xml:space="preserve"> </w:t>
                       </w:r>
                       <w:r>
                         <w:rPr>
@@ -2419,7 +2502,7 @@
                           <w:color w:val="FFFFFF"/>
                           <w:spacing w:val="-32"/>
                         </w:rPr>
-                        <w:t> </w:t>
+                        <w:t xml:space="preserve"> </w:t>
                       </w:r>
                       <w:r>
                         <w:rPr>
@@ -2433,7 +2516,7 @@
                           <w:color w:val="FFFFFF"/>
                           <w:spacing w:val="-35"/>
                         </w:rPr>
-                        <w:t> </w:t>
+                        <w:t xml:space="preserve"> </w:t>
                       </w:r>
                       <w:r>
                         <w:rPr>
@@ -2447,7 +2530,7 @@
                           <w:color w:val="FFFFFF"/>
                           <w:spacing w:val="-28"/>
                         </w:rPr>
-                        <w:t> </w:t>
+                        <w:t xml:space="preserve"> </w:t>
                       </w:r>
                       <w:r>
                         <w:rPr>
@@ -2461,7 +2544,7 @@
                           <w:color w:val="FFFFFF"/>
                           <w:spacing w:val="-30"/>
                         </w:rPr>
-                        <w:t> </w:t>
+                        <w:t xml:space="preserve"> </w:t>
                       </w:r>
                       <w:r>
                         <w:rPr>
@@ -2510,7 +2593,7 @@
                           <w:color w:val="FFFFFF"/>
                           <w:spacing w:val="-38"/>
                         </w:rPr>
-                        <w:t> </w:t>
+                        <w:t xml:space="preserve"> </w:t>
                       </w:r>
                       <w:r>
                         <w:rPr>
@@ -2524,7 +2607,7 @@
                           <w:color w:val="FFFFFF"/>
                           <w:spacing w:val="-32"/>
                         </w:rPr>
-                        <w:t> </w:t>
+                        <w:t xml:space="preserve"> </w:t>
                       </w:r>
                       <w:r>
                         <w:rPr>
@@ -2538,14 +2621,14 @@
                           <w:color w:val="FFFFFF"/>
                           <w:spacing w:val="-38"/>
                         </w:rPr>
-                        <w:t> </w:t>
+                        <w:t xml:space="preserve"> </w:t>
                       </w:r>
                       <w:r>
                         <w:rPr>
                           <w:color w:val="FFFFFF"/>
                           <w:spacing w:val="-8"/>
                         </w:rPr>
-                        <w:t>Thing </w:t>
+                        <w:t xml:space="preserve">Thing </w:t>
                       </w:r>
                       <w:r>
                         <w:rPr>
@@ -2585,7 +2668,7 @@
                           <w:color w:val="FFFFFF"/>
                           <w:spacing w:val="-36"/>
                         </w:rPr>
-                        <w:t> </w:t>
+                        <w:t xml:space="preserve"> </w:t>
                       </w:r>
                       <w:r>
                         <w:rPr>
@@ -2599,7 +2682,7 @@
                           <w:color w:val="FFFFFF"/>
                           <w:spacing w:val="-16"/>
                         </w:rPr>
-                        <w:t> </w:t>
+                        <w:t xml:space="preserve"> </w:t>
                       </w:r>
                       <w:r>
                         <w:rPr>
@@ -2611,8 +2694,7 @@
                     </w:p>
                   </w:txbxContent>
                 </v:textbox>
-                <v:fill type="solid"/>
-                <v:stroke dashstyle="solid"/>
+                <w10:anchorlock/>
               </v:shape>
             </w:pict>
           </mc:Fallback>
@@ -2622,32 +2704,29 @@
         <w:rPr>
           <w:sz w:val="20"/>
         </w:rPr>
-      </w:r>
-      <w:r>
-        <w:rPr>
-          <w:sz w:val="20"/>
-        </w:rPr>
         <w:tab/>
       </w:r>
       <w:r>
         <w:rPr>
+          <w:noProof/>
           <w:sz w:val="20"/>
         </w:rPr>
         <mc:AlternateContent>
           <mc:Choice Requires="wps">
             <w:drawing>
-              <wp:inline distT="0" distB="0" distL="0" distR="0">
+              <wp:inline distT="0" distB="0" distL="0" distR="0" wp14:anchorId="4656942B" wp14:editId="027F21E6">
                 <wp:extent cx="3636010" cy="2569210"/>
                 <wp:effectExtent l="9525" t="9525" r="2539" b="12064"/>
                 <wp:docPr id="8" name="Textbox 8"/>
                 <wp:cNvGraphicFramePr>
-                  <a:graphicFrameLocks/>
+                  <a:graphicFrameLocks xmlns:a="http://schemas.openxmlformats.org/drawingml/2006/main"/>
                 </wp:cNvGraphicFramePr>
-                <a:graphic>
+                <a:graphic xmlns:a="http://schemas.openxmlformats.org/drawingml/2006/main">
                   <a:graphicData uri="http://schemas.microsoft.com/office/word/2010/wordprocessingShape">
                     <wps:wsp>
-                      <wps:cNvPr id="8" name="Textbox 8"/>
-                      <wps:cNvSpPr txBox="1"/>
+                      <wps:cNvSpPr txBox="1">
+                        <a:spLocks/>
+                      </wps:cNvSpPr>
                       <wps:spPr>
                         <a:xfrm>
                           <a:off x="0" y="0"/>
@@ -2721,7 +2800,7 @@
                                 <w:color w:val="FFFFFF"/>
                                 <w:spacing w:val="-32"/>
                               </w:rPr>
-                              <w:t> </w:t>
+                              <w:t xml:space="preserve"> </w:t>
                             </w:r>
                             <w:r>
                               <w:rPr>
@@ -2735,7 +2814,7 @@
                                 <w:color w:val="FFFFFF"/>
                                 <w:spacing w:val="-32"/>
                               </w:rPr>
-                              <w:t> </w:t>
+                              <w:t xml:space="preserve"> </w:t>
                             </w:r>
                             <w:r>
                               <w:rPr>
@@ -2749,7 +2828,7 @@
                                 <w:color w:val="FFFFFF"/>
                                 <w:spacing w:val="-35"/>
                               </w:rPr>
-                              <w:t> </w:t>
+                              <w:t xml:space="preserve"> </w:t>
                             </w:r>
                             <w:r>
                               <w:rPr>
@@ -2763,7 +2842,7 @@
                                 <w:color w:val="FFFFFF"/>
                                 <w:spacing w:val="-28"/>
                               </w:rPr>
-                              <w:t> </w:t>
+                              <w:t xml:space="preserve"> </w:t>
                             </w:r>
                             <w:r>
                               <w:rPr>
@@ -2777,7 +2856,7 @@
                                 <w:color w:val="FFFFFF"/>
                                 <w:spacing w:val="-30"/>
                               </w:rPr>
-                              <w:t> </w:t>
+                              <w:t xml:space="preserve"> </w:t>
                             </w:r>
                             <w:r>
                               <w:rPr>
@@ -2800,8 +2879,8 @@
           </mc:Choice>
           <mc:Fallback>
             <w:pict>
-              <v:shape style="width:286.3pt;height:202.3pt;mso-position-horizontal-relative:char;mso-position-vertical-relative:line" type="#_x0000_t202" id="docshape7" filled="true" fillcolor="#155f82" stroked="true" strokeweight="1.5pt" strokecolor="#042333">
-                <w10:anchorlock/>
+              <v:shape w14:anchorId="4656942B" id="Textbox 8" o:spid="_x0000_s1031" type="#_x0000_t202" style="width:286.3pt;height:202.3pt;visibility:visible;mso-wrap-style:square;mso-left-percent:-10001;mso-top-percent:-10001;mso-position-horizontal:absolute;mso-position-horizontal-relative:char;mso-position-vertical:absolute;mso-position-vertical-relative:line;mso-left-percent:-10001;mso-top-percent:-10001;v-text-anchor:top" o:gfxdata="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" fillcolor="#155f82" strokecolor="#042333" strokeweight="1.5pt">
+                <v:path arrowok="t"/>
                 <v:textbox inset="0,0,0,0">
                   <w:txbxContent>
                     <w:p>
@@ -2857,7 +2936,7 @@
                           <w:color w:val="FFFFFF"/>
                           <w:spacing w:val="-32"/>
                         </w:rPr>
-                        <w:t> </w:t>
+                        <w:t xml:space="preserve"> </w:t>
                       </w:r>
                       <w:r>
                         <w:rPr>
@@ -2871,7 +2950,7 @@
                           <w:color w:val="FFFFFF"/>
                           <w:spacing w:val="-32"/>
                         </w:rPr>
-                        <w:t> </w:t>
+                        <w:t xml:space="preserve"> </w:t>
                       </w:r>
                       <w:r>
                         <w:rPr>
@@ -2885,7 +2964,7 @@
                           <w:color w:val="FFFFFF"/>
                           <w:spacing w:val="-35"/>
                         </w:rPr>
-                        <w:t> </w:t>
+                        <w:t xml:space="preserve"> </w:t>
                       </w:r>
                       <w:r>
                         <w:rPr>
@@ -2899,7 +2978,7 @@
                           <w:color w:val="FFFFFF"/>
                           <w:spacing w:val="-28"/>
                         </w:rPr>
-                        <w:t> </w:t>
+                        <w:t xml:space="preserve"> </w:t>
                       </w:r>
                       <w:r>
                         <w:rPr>
@@ -2913,7 +2992,7 @@
                           <w:color w:val="FFFFFF"/>
                           <w:spacing w:val="-30"/>
                         </w:rPr>
-                        <w:t> </w:t>
+                        <w:t xml:space="preserve"> </w:t>
                       </w:r>
                       <w:r>
                         <w:rPr>
@@ -2925,8 +3004,7 @@
                     </w:p>
                   </w:txbxContent>
                 </v:textbox>
-                <v:fill type="solid"/>
-                <v:stroke dashstyle="solid"/>
+                <w10:anchorlock/>
               </v:shape>
             </w:pict>
           </mc:Fallback>
@@ -2936,32 +3014,29 @@
         <w:rPr>
           <w:sz w:val="20"/>
         </w:rPr>
-      </w:r>
-      <w:r>
-        <w:rPr>
-          <w:sz w:val="20"/>
-        </w:rPr>
         <w:tab/>
       </w:r>
       <w:r>
         <w:rPr>
+          <w:noProof/>
           <w:sz w:val="20"/>
         </w:rPr>
         <mc:AlternateContent>
           <mc:Choice Requires="wps">
             <w:drawing>
-              <wp:inline distT="0" distB="0" distL="0" distR="0">
+              <wp:inline distT="0" distB="0" distL="0" distR="0" wp14:anchorId="624413B9" wp14:editId="68B58FA0">
                 <wp:extent cx="3636010" cy="2569210"/>
                 <wp:effectExtent l="9525" t="9525" r="2539" b="12064"/>
                 <wp:docPr id="9" name="Textbox 9"/>
                 <wp:cNvGraphicFramePr>
-                  <a:graphicFrameLocks/>
+                  <a:graphicFrameLocks xmlns:a="http://schemas.openxmlformats.org/drawingml/2006/main"/>
                 </wp:cNvGraphicFramePr>
-                <a:graphic>
+                <a:graphic xmlns:a="http://schemas.openxmlformats.org/drawingml/2006/main">
                   <a:graphicData uri="http://schemas.microsoft.com/office/word/2010/wordprocessingShape">
                     <wps:wsp>
-                      <wps:cNvPr id="9" name="Textbox 9"/>
-                      <wps:cNvSpPr txBox="1"/>
+                      <wps:cNvSpPr txBox="1">
+                        <a:spLocks/>
+                      </wps:cNvSpPr>
                       <wps:spPr>
                         <a:xfrm>
                           <a:off x="0" y="0"/>
@@ -3035,7 +3110,7 @@
                                 <w:color w:val="FFFFFF"/>
                                 <w:spacing w:val="-32"/>
                               </w:rPr>
-                              <w:t> </w:t>
+                              <w:t xml:space="preserve"> </w:t>
                             </w:r>
                             <w:r>
                               <w:rPr>
@@ -3049,7 +3124,7 @@
                                 <w:color w:val="FFFFFF"/>
                                 <w:spacing w:val="-32"/>
                               </w:rPr>
-                              <w:t> </w:t>
+                              <w:t xml:space="preserve"> </w:t>
                             </w:r>
                             <w:r>
                               <w:rPr>
@@ -3063,7 +3138,7 @@
                                 <w:color w:val="FFFFFF"/>
                                 <w:spacing w:val="-35"/>
                               </w:rPr>
-                              <w:t> </w:t>
+                              <w:t xml:space="preserve"> </w:t>
                             </w:r>
                             <w:r>
                               <w:rPr>
@@ -3077,7 +3152,7 @@
                                 <w:color w:val="FFFFFF"/>
                                 <w:spacing w:val="-28"/>
                               </w:rPr>
-                              <w:t> </w:t>
+                              <w:t xml:space="preserve"> </w:t>
                             </w:r>
                             <w:r>
                               <w:rPr>
@@ -3091,7 +3166,7 @@
                                 <w:color w:val="FFFFFF"/>
                                 <w:spacing w:val="-30"/>
                               </w:rPr>
-                              <w:t> </w:t>
+                              <w:t xml:space="preserve"> </w:t>
                             </w:r>
                             <w:r>
                               <w:rPr>
@@ -3114,8 +3189,8 @@
           </mc:Choice>
           <mc:Fallback>
             <w:pict>
-              <v:shape style="width:286.3pt;height:202.3pt;mso-position-horizontal-relative:char;mso-position-vertical-relative:line" type="#_x0000_t202" id="docshape8" filled="true" fillcolor="#155f82" stroked="true" strokeweight="1.5pt" strokecolor="#042333">
-                <w10:anchorlock/>
+              <v:shape w14:anchorId="624413B9" id="Textbox 9" o:spid="_x0000_s1032" type="#_x0000_t202" style="width:286.3pt;height:202.3pt;visibility:visible;mso-wrap-style:square;mso-left-percent:-10001;mso-top-percent:-10001;mso-position-horizontal:absolute;mso-position-horizontal-relative:char;mso-position-vertical:absolute;mso-position-vertical-relative:line;mso-left-percent:-10001;mso-top-percent:-10001;v-text-anchor:top" o:gfxdata="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" fillcolor="#155f82" strokecolor="#042333" strokeweight="1.5pt">
+                <v:path arrowok="t"/>
                 <v:textbox inset="0,0,0,0">
                   <w:txbxContent>
                     <w:p>
@@ -3171,7 +3246,7 @@
                           <w:color w:val="FFFFFF"/>
                           <w:spacing w:val="-32"/>
                         </w:rPr>
-                        <w:t> </w:t>
+                        <w:t xml:space="preserve"> </w:t>
                       </w:r>
                       <w:r>
                         <w:rPr>
@@ -3185,7 +3260,7 @@
                           <w:color w:val="FFFFFF"/>
                           <w:spacing w:val="-32"/>
                         </w:rPr>
-                        <w:t> </w:t>
+                        <w:t xml:space="preserve"> </w:t>
                       </w:r>
                       <w:r>
                         <w:rPr>
@@ -3199,7 +3274,7 @@
                           <w:color w:val="FFFFFF"/>
                           <w:spacing w:val="-35"/>
                         </w:rPr>
-                        <w:t> </w:t>
+                        <w:t xml:space="preserve"> </w:t>
                       </w:r>
                       <w:r>
                         <w:rPr>
@@ -3213,7 +3288,7 @@
                           <w:color w:val="FFFFFF"/>
                           <w:spacing w:val="-28"/>
                         </w:rPr>
-                        <w:t> </w:t>
+                        <w:t xml:space="preserve"> </w:t>
                       </w:r>
                       <w:r>
                         <w:rPr>
@@ -3227,7 +3302,7 @@
                           <w:color w:val="FFFFFF"/>
                           <w:spacing w:val="-30"/>
                         </w:rPr>
-                        <w:t> </w:t>
+                        <w:t xml:space="preserve"> </w:t>
                       </w:r>
                       <w:r>
                         <w:rPr>
@@ -3239,17 +3314,11 @@
                     </w:p>
                   </w:txbxContent>
                 </v:textbox>
-                <v:fill type="solid"/>
-                <v:stroke dashstyle="solid"/>
+                <w10:anchorlock/>
               </v:shape>
             </w:pict>
           </mc:Fallback>
         </mc:AlternateContent>
-      </w:r>
-      <w:r>
-        <w:rPr>
-          <w:sz w:val="20"/>
-        </w:rPr>
       </w:r>
     </w:p>
     <w:p>
@@ -3264,7 +3333,6 @@
     <w:tbl>
       <w:tblPr>
         <w:tblW w:w="0" w:type="auto"/>
-        <w:jc w:val="left"/>
         <w:tblInd w:w="224" w:type="dxa"/>
         <w:tblBorders>
           <w:top w:val="single" w:sz="12" w:space="0" w:color="042333"/>
@@ -3276,12 +3344,10 @@
         </w:tblBorders>
         <w:tblLayout w:type="fixed"/>
         <w:tblCellMar>
-          <w:top w:w="0" w:type="dxa"/>
           <w:left w:w="0" w:type="dxa"/>
-          <w:bottom w:w="0" w:type="dxa"/>
           <w:right w:w="0" w:type="dxa"/>
         </w:tblCellMar>
-        <w:tblLook w:val="01E0"/>
+        <w:tblLook w:val="01E0" w:firstRow="1" w:lastRow="1" w:firstColumn="1" w:lastColumn="1" w:noHBand="0" w:noVBand="0"/>
       </w:tblPr>
       <w:tblGrid>
         <w:gridCol w:w="5726"/>
@@ -3293,7 +3359,7 @@
       </w:tblGrid>
       <w:tr>
         <w:trPr>
-          <w:trHeight w:val="4015" w:hRule="atLeast"/>
+          <w:trHeight w:val="4015"/>
         </w:trPr>
         <w:tc>
           <w:tcPr>
@@ -3359,7 +3425,7 @@
                 <w:spacing w:val="-32"/>
                 <w:sz w:val="36"/>
               </w:rPr>
-              <w:t> </w:t>
+              <w:t xml:space="preserve"> </w:t>
             </w:r>
             <w:r>
               <w:rPr>
@@ -3375,7 +3441,7 @@
                 <w:spacing w:val="-32"/>
                 <w:sz w:val="36"/>
               </w:rPr>
-              <w:t> </w:t>
+              <w:t xml:space="preserve"> </w:t>
             </w:r>
             <w:r>
               <w:rPr>
@@ -3391,7 +3457,7 @@
                 <w:spacing w:val="-35"/>
                 <w:sz w:val="36"/>
               </w:rPr>
-              <w:t> </w:t>
+              <w:t xml:space="preserve"> </w:t>
             </w:r>
             <w:r>
               <w:rPr>
@@ -3407,7 +3473,7 @@
                 <w:spacing w:val="-28"/>
                 <w:sz w:val="36"/>
               </w:rPr>
-              <w:t> </w:t>
+              <w:t xml:space="preserve"> </w:t>
             </w:r>
             <w:r>
               <w:rPr>
@@ -3423,7 +3489,7 @@
                 <w:spacing w:val="-30"/>
                 <w:sz w:val="36"/>
               </w:rPr>
-              <w:t> </w:t>
+              <w:t xml:space="preserve"> </w:t>
             </w:r>
             <w:r>
               <w:rPr>
@@ -3517,7 +3583,7 @@
                 <w:spacing w:val="-32"/>
                 <w:sz w:val="36"/>
               </w:rPr>
-              <w:t> </w:t>
+              <w:t xml:space="preserve"> </w:t>
             </w:r>
             <w:r>
               <w:rPr>
@@ -3533,7 +3599,7 @@
                 <w:spacing w:val="-32"/>
                 <w:sz w:val="36"/>
               </w:rPr>
-              <w:t> </w:t>
+              <w:t xml:space="preserve"> </w:t>
             </w:r>
             <w:r>
               <w:rPr>
@@ -3549,7 +3615,7 @@
                 <w:spacing w:val="-35"/>
                 <w:sz w:val="36"/>
               </w:rPr>
-              <w:t> </w:t>
+              <w:t xml:space="preserve"> </w:t>
             </w:r>
             <w:r>
               <w:rPr>
@@ -3565,7 +3631,7 @@
                 <w:spacing w:val="-28"/>
                 <w:sz w:val="36"/>
               </w:rPr>
-              <w:t> </w:t>
+              <w:t xml:space="preserve"> </w:t>
             </w:r>
             <w:r>
               <w:rPr>
@@ -3581,7 +3647,7 @@
                 <w:spacing w:val="-30"/>
                 <w:sz w:val="36"/>
               </w:rPr>
-              <w:t> </w:t>
+              <w:t xml:space="preserve"> </w:t>
             </w:r>
             <w:r>
               <w:rPr>
@@ -3676,7 +3742,7 @@
                 <w:spacing w:val="-32"/>
                 <w:sz w:val="36"/>
               </w:rPr>
-              <w:t> </w:t>
+              <w:t xml:space="preserve"> </w:t>
             </w:r>
             <w:r>
               <w:rPr>
@@ -3692,7 +3758,7 @@
                 <w:spacing w:val="-32"/>
                 <w:sz w:val="36"/>
               </w:rPr>
-              <w:t> </w:t>
+              <w:t xml:space="preserve"> </w:t>
             </w:r>
             <w:r>
               <w:rPr>
@@ -3708,7 +3774,7 @@
                 <w:spacing w:val="-35"/>
                 <w:sz w:val="36"/>
               </w:rPr>
-              <w:t> </w:t>
+              <w:t xml:space="preserve"> </w:t>
             </w:r>
             <w:r>
               <w:rPr>
@@ -3724,7 +3790,7 @@
                 <w:spacing w:val="-28"/>
                 <w:sz w:val="36"/>
               </w:rPr>
-              <w:t> </w:t>
+              <w:t xml:space="preserve"> </w:t>
             </w:r>
             <w:r>
               <w:rPr>
@@ -3740,7 +3806,7 @@
                 <w:spacing w:val="-30"/>
                 <w:sz w:val="36"/>
               </w:rPr>
-              <w:t> </w:t>
+              <w:t xml:space="preserve"> </w:t>
             </w:r>
             <w:r>
               <w:rPr>
@@ -3755,7 +3821,7 @@
       </w:tr>
       <w:tr>
         <w:trPr>
-          <w:trHeight w:val="484" w:hRule="atLeast"/>
+          <w:trHeight w:val="484"/>
         </w:trPr>
         <w:tc>
           <w:tcPr>
@@ -3790,7 +3856,7 @@
                 <w:spacing w:val="-30"/>
                 <w:sz w:val="36"/>
               </w:rPr>
-              <w:t> </w:t>
+              <w:t xml:space="preserve"> </w:t>
             </w:r>
             <w:r>
               <w:rPr>
@@ -3804,7 +3870,7 @@
                 <w:spacing w:val="-25"/>
                 <w:sz w:val="36"/>
               </w:rPr>
-              <w:t> </w:t>
+              <w:t xml:space="preserve"> </w:t>
             </w:r>
             <w:r>
               <w:rPr>
@@ -3818,7 +3884,7 @@
                 <w:spacing w:val="-34"/>
                 <w:sz w:val="36"/>
               </w:rPr>
-              <w:t> </w:t>
+              <w:t xml:space="preserve"> </w:t>
             </w:r>
             <w:r>
               <w:rPr>
@@ -3853,49 +3919,50 @@
     <w:p>
       <w:pPr>
         <w:pStyle w:val="TableParagraph"/>
-        <w:spacing w:after="0"/>
         <w:rPr>
           <w:rFonts w:ascii="Times New Roman"/>
           <w:sz w:val="36"/>
         </w:rPr>
         <w:sectPr>
           <w:pgSz w:w="19200" w:h="10800" w:orient="landscape"/>
-          <w:pgMar w:top="420" w:bottom="0" w:left="425" w:right="141"/>
+          <w:pgMar w:top="420" w:right="141" w:bottom="0" w:left="425" w:header="720" w:footer="720" w:gutter="0"/>
+          <w:cols w:space="720"/>
         </w:sectPr>
       </w:pPr>
     </w:p>
     <w:p>
       <w:pPr>
         <w:tabs>
-          <w:tab w:pos="6314" w:val="left" w:leader="none"/>
-          <w:tab w:pos="12554" w:val="left" w:leader="none"/>
+          <w:tab w:val="left" w:pos="6314"/>
+          <w:tab w:val="left" w:pos="12554"/>
         </w:tabs>
-        <w:spacing w:line="240" w:lineRule="auto"/>
-        <w:ind w:left="777" w:right="0" w:firstLine="0"/>
-        <w:jc w:val="left"/>
+        <w:ind w:left="777"/>
         <w:rPr>
           <w:sz w:val="20"/>
         </w:rPr>
       </w:pPr>
       <w:r>
         <w:rPr>
+          <w:noProof/>
           <w:sz w:val="20"/>
         </w:rPr>
+        <w:lastRenderedPageBreak/>
         <mc:AlternateContent>
           <mc:Choice Requires="wps">
             <w:drawing>
-              <wp:inline distT="0" distB="0" distL="0" distR="0">
+              <wp:inline distT="0" distB="0" distL="0" distR="0" wp14:anchorId="1853E1CB" wp14:editId="6509D51A">
                 <wp:extent cx="2558415" cy="2242820"/>
                 <wp:effectExtent l="9525" t="9525" r="3810" b="14605"/>
                 <wp:docPr id="10" name="Textbox 10"/>
                 <wp:cNvGraphicFramePr>
-                  <a:graphicFrameLocks/>
+                  <a:graphicFrameLocks xmlns:a="http://schemas.openxmlformats.org/drawingml/2006/main"/>
                 </wp:cNvGraphicFramePr>
-                <a:graphic>
+                <a:graphic xmlns:a="http://schemas.openxmlformats.org/drawingml/2006/main">
                   <a:graphicData uri="http://schemas.microsoft.com/office/word/2010/wordprocessingShape">
                     <wps:wsp>
-                      <wps:cNvPr id="10" name="Textbox 10"/>
-                      <wps:cNvSpPr txBox="1"/>
+                      <wps:cNvSpPr txBox="1">
+                        <a:spLocks/>
+                      </wps:cNvSpPr>
                       <wps:spPr>
                         <a:xfrm>
                           <a:off x="0" y="0"/>
@@ -3944,21 +4011,15 @@
                           <w:p>
                             <w:pPr>
                               <w:spacing w:before="1"/>
-                              <w:ind w:left="1250" w:right="0" w:firstLine="0"/>
-                              <w:jc w:val="left"/>
+                              <w:ind w:left="1250"/>
                               <w:rPr>
                                 <w:rFonts w:ascii="Segoe UI"/>
                                 <w:color w:val="000000"/>
                                 <w:sz w:val="36"/>
                               </w:rPr>
                             </w:pPr>
-                            <w:bookmarkStart w:name="Slide 5" w:id="7"/>
-                            <w:bookmarkEnd w:id="7"/>
-                            <w:r>
-                              <w:rPr>
-                                <w:color w:val="000000"/>
-                              </w:rPr>
-                            </w:r>
+                            <w:bookmarkStart w:id="6" w:name="Slide_5"/>
+                            <w:bookmarkEnd w:id="6"/>
                             <w:r>
                               <w:rPr>
                                 <w:rFonts w:ascii="Segoe UI"/>
@@ -3982,8 +4043,8 @@
           </mc:Choice>
           <mc:Fallback>
             <w:pict>
-              <v:shape style="width:201.45pt;height:176.6pt;mso-position-horizontal-relative:char;mso-position-vertical-relative:line" type="#_x0000_t202" id="docshape9" filled="true" fillcolor="#790909" stroked="true" strokeweight="1.5pt" strokecolor="#042333">
-                <w10:anchorlock/>
+              <v:shape w14:anchorId="1853E1CB" id="Textbox 10" o:spid="_x0000_s1033" type="#_x0000_t202" style="width:201.45pt;height:176.6pt;visibility:visible;mso-wrap-style:square;mso-left-percent:-10001;mso-top-percent:-10001;mso-position-horizontal:absolute;mso-position-horizontal-relative:char;mso-position-vertical:absolute;mso-position-vertical-relative:line;mso-left-percent:-10001;mso-top-percent:-10001;v-text-anchor:top" o:gfxdata="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" fillcolor="#790909" strokecolor="#042333" strokeweight="1.5pt">
+                <v:path arrowok="t"/>
                 <v:textbox inset="0,0,0,0">
                   <w:txbxContent>
                     <w:p>
@@ -4014,21 +4075,15 @@
                     <w:p>
                       <w:pPr>
                         <w:spacing w:before="1"/>
-                        <w:ind w:left="1250" w:right="0" w:firstLine="0"/>
-                        <w:jc w:val="left"/>
+                        <w:ind w:left="1250"/>
                         <w:rPr>
                           <w:rFonts w:ascii="Segoe UI"/>
                           <w:color w:val="000000"/>
                           <w:sz w:val="36"/>
                         </w:rPr>
                       </w:pPr>
-                      <w:bookmarkStart w:name="Slide 5" w:id="8"/>
-                      <w:bookmarkEnd w:id="8"/>
-                      <w:r>
-                        <w:rPr>
-                          <w:color w:val="000000"/>
-                        </w:rPr>
-                      </w:r>
+                      <w:bookmarkStart w:id="7" w:name="Slide_5"/>
+                      <w:bookmarkEnd w:id="7"/>
                       <w:r>
                         <w:rPr>
                           <w:rFonts w:ascii="Segoe UI"/>
@@ -4041,8 +4096,7 @@
                     </w:p>
                   </w:txbxContent>
                 </v:textbox>
-                <v:fill type="solid"/>
-                <v:stroke dashstyle="solid"/>
+                <w10:anchorlock/>
               </v:shape>
             </w:pict>
           </mc:Fallback>
@@ -4052,32 +4106,29 @@
         <w:rPr>
           <w:sz w:val="20"/>
         </w:rPr>
-      </w:r>
-      <w:r>
-        <w:rPr>
-          <w:sz w:val="20"/>
-        </w:rPr>
         <w:tab/>
       </w:r>
       <w:r>
         <w:rPr>
+          <w:noProof/>
           <w:sz w:val="20"/>
         </w:rPr>
         <mc:AlternateContent>
           <mc:Choice Requires="wps">
             <w:drawing>
-              <wp:inline distT="0" distB="0" distL="0" distR="0">
+              <wp:inline distT="0" distB="0" distL="0" distR="0" wp14:anchorId="454134AA" wp14:editId="718E3F03">
                 <wp:extent cx="2558415" cy="2242820"/>
                 <wp:effectExtent l="9525" t="9525" r="3810" b="14605"/>
                 <wp:docPr id="11" name="Textbox 11"/>
                 <wp:cNvGraphicFramePr>
-                  <a:graphicFrameLocks/>
+                  <a:graphicFrameLocks xmlns:a="http://schemas.openxmlformats.org/drawingml/2006/main"/>
                 </wp:cNvGraphicFramePr>
-                <a:graphic>
+                <a:graphic xmlns:a="http://schemas.openxmlformats.org/drawingml/2006/main">
                   <a:graphicData uri="http://schemas.microsoft.com/office/word/2010/wordprocessingShape">
                     <wps:wsp>
-                      <wps:cNvPr id="11" name="Textbox 11"/>
-                      <wps:cNvSpPr txBox="1"/>
+                      <wps:cNvSpPr txBox="1">
+                        <a:spLocks/>
+                      </wps:cNvSpPr>
                       <wps:spPr>
                         <a:xfrm>
                           <a:off x="0" y="0"/>
@@ -4125,8 +4176,7 @@
                           </w:p>
                           <w:p>
                             <w:pPr>
-                              <w:spacing w:before="0"/>
-                              <w:ind w:left="2" w:right="1" w:firstLine="0"/>
+                              <w:ind w:left="2" w:right="1"/>
                               <w:jc w:val="center"/>
                               <w:rPr>
                                 <w:rFonts w:ascii="Segoe UI"/>
@@ -4157,8 +4207,8 @@
           </mc:Choice>
           <mc:Fallback>
             <w:pict>
-              <v:shape style="width:201.45pt;height:176.6pt;mso-position-horizontal-relative:char;mso-position-vertical-relative:line" type="#_x0000_t202" id="docshape10" filled="true" fillcolor="#c41e1e" stroked="true" strokeweight="1.5pt" strokecolor="#042333">
-                <w10:anchorlock/>
+              <v:shape w14:anchorId="454134AA" id="Textbox 11" o:spid="_x0000_s1034" type="#_x0000_t202" style="width:201.45pt;height:176.6pt;visibility:visible;mso-wrap-style:square;mso-left-percent:-10001;mso-top-percent:-10001;mso-position-horizontal:absolute;mso-position-horizontal-relative:char;mso-position-vertical:absolute;mso-position-vertical-relative:line;mso-left-percent:-10001;mso-top-percent:-10001;v-text-anchor:top" o:gfxdata="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" fillcolor="#c41e1e" strokecolor="#042333" strokeweight="1.5pt">
+                <v:path arrowok="t"/>
                 <v:textbox inset="0,0,0,0">
                   <w:txbxContent>
                     <w:p>
@@ -4188,8 +4238,7 @@
                     </w:p>
                     <w:p>
                       <w:pPr>
-                        <w:spacing w:before="0"/>
-                        <w:ind w:left="2" w:right="1" w:firstLine="0"/>
+                        <w:ind w:left="2" w:right="1"/>
                         <w:jc w:val="center"/>
                         <w:rPr>
                           <w:rFonts w:ascii="Segoe UI"/>
@@ -4209,8 +4258,7 @@
                     </w:p>
                   </w:txbxContent>
                 </v:textbox>
-                <v:fill type="solid"/>
-                <v:stroke dashstyle="solid"/>
+                <w10:anchorlock/>
               </v:shape>
             </w:pict>
           </mc:Fallback>
@@ -4220,32 +4268,29 @@
         <w:rPr>
           <w:sz w:val="20"/>
         </w:rPr>
-      </w:r>
-      <w:r>
-        <w:rPr>
-          <w:sz w:val="20"/>
-        </w:rPr>
         <w:tab/>
       </w:r>
       <w:r>
         <w:rPr>
+          <w:noProof/>
           <w:sz w:val="20"/>
         </w:rPr>
         <mc:AlternateContent>
           <mc:Choice Requires="wps">
             <w:drawing>
-              <wp:inline distT="0" distB="0" distL="0" distR="0">
+              <wp:inline distT="0" distB="0" distL="0" distR="0" wp14:anchorId="79144D73" wp14:editId="1AEC1C42">
                 <wp:extent cx="2558415" cy="2242820"/>
                 <wp:effectExtent l="9525" t="9525" r="3810" b="14605"/>
                 <wp:docPr id="12" name="Textbox 12"/>
                 <wp:cNvGraphicFramePr>
-                  <a:graphicFrameLocks/>
+                  <a:graphicFrameLocks xmlns:a="http://schemas.openxmlformats.org/drawingml/2006/main"/>
                 </wp:cNvGraphicFramePr>
-                <a:graphic>
+                <a:graphic xmlns:a="http://schemas.openxmlformats.org/drawingml/2006/main">
                   <a:graphicData uri="http://schemas.microsoft.com/office/word/2010/wordprocessingShape">
                     <wps:wsp>
-                      <wps:cNvPr id="12" name="Textbox 12"/>
-                      <wps:cNvSpPr txBox="1"/>
+                      <wps:cNvSpPr txBox="1">
+                        <a:spLocks/>
+                      </wps:cNvSpPr>
                       <wps:spPr>
                         <a:xfrm>
                           <a:off x="0" y="0"/>
@@ -4294,7 +4339,7 @@
                           <w:p>
                             <w:pPr>
                               <w:spacing w:before="1"/>
-                              <w:ind w:left="2" w:right="0" w:firstLine="0"/>
+                              <w:ind w:left="2"/>
                               <w:jc w:val="center"/>
                               <w:rPr>
                                 <w:rFonts w:ascii="Courier New"/>
@@ -4325,8 +4370,8 @@
           </mc:Choice>
           <mc:Fallback>
             <w:pict>
-              <v:shape style="width:201.45pt;height:176.6pt;mso-position-horizontal-relative:char;mso-position-vertical-relative:line" type="#_x0000_t202" id="docshape11" filled="true" fillcolor="#1a1a1a" stroked="true" strokeweight="1.5pt" strokecolor="#042333">
-                <w10:anchorlock/>
+              <v:shape w14:anchorId="79144D73" id="Textbox 12" o:spid="_x0000_s1035" type="#_x0000_t202" style="width:201.45pt;height:176.6pt;visibility:visible;mso-wrap-style:square;mso-left-percent:-10001;mso-top-percent:-10001;mso-position-horizontal:absolute;mso-position-horizontal-relative:char;mso-position-vertical:absolute;mso-position-vertical-relative:line;mso-left-percent:-10001;mso-top-percent:-10001;v-text-anchor:top" o:gfxdata="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" fillcolor="#1a1a1a" strokecolor="#042333" strokeweight="1.5pt">
+                <v:path arrowok="t"/>
                 <v:textbox inset="0,0,0,0">
                   <w:txbxContent>
                     <w:p>
@@ -4357,7 +4402,7 @@
                     <w:p>
                       <w:pPr>
                         <w:spacing w:before="1"/>
-                        <w:ind w:left="2" w:right="0" w:firstLine="0"/>
+                        <w:ind w:left="2"/>
                         <w:jc w:val="center"/>
                         <w:rPr>
                           <w:rFonts w:ascii="Courier New"/>
@@ -4377,17 +4422,11 @@
                     </w:p>
                   </w:txbxContent>
                 </v:textbox>
-                <v:fill type="solid"/>
-                <v:stroke dashstyle="solid"/>
+                <w10:anchorlock/>
               </v:shape>
             </w:pict>
           </mc:Fallback>
         </mc:AlternateContent>
-      </w:r>
-      <w:r>
-        <w:rPr>
-          <w:sz w:val="20"/>
-        </w:rPr>
       </w:r>
     </w:p>
     <w:p>
@@ -4416,12 +4455,13 @@
       </w:pPr>
       <w:r>
         <w:rPr>
+          <w:noProof/>
           <w:sz w:val="20"/>
         </w:rPr>
         <mc:AlternateContent>
           <mc:Choice Requires="wps">
             <w:drawing>
-              <wp:anchor distT="0" distB="0" distL="0" distR="0" allowOverlap="1" layoutInCell="1" locked="0" behindDoc="1" simplePos="0" relativeHeight="487593984">
+              <wp:anchor distT="0" distB="0" distL="0" distR="0" simplePos="0" relativeHeight="487593984" behindDoc="1" locked="0" layoutInCell="1" allowOverlap="1" wp14:anchorId="6F04BD9B" wp14:editId="23EAD4E7">
                 <wp:simplePos x="0" y="0"/>
                 <wp:positionH relativeFrom="page">
                   <wp:posOffset>2634360</wp:posOffset>
@@ -4434,13 +4474,14 @@
                 <wp:wrapTopAndBottom/>
                 <wp:docPr id="13" name="Textbox 13"/>
                 <wp:cNvGraphicFramePr>
-                  <a:graphicFrameLocks/>
+                  <a:graphicFrameLocks xmlns:a="http://schemas.openxmlformats.org/drawingml/2006/main"/>
                 </wp:cNvGraphicFramePr>
-                <a:graphic>
+                <a:graphic xmlns:a="http://schemas.openxmlformats.org/drawingml/2006/main">
                   <a:graphicData uri="http://schemas.microsoft.com/office/word/2010/wordprocessingShape">
                     <wps:wsp>
-                      <wps:cNvPr id="13" name="Textbox 13"/>
-                      <wps:cNvSpPr txBox="1"/>
+                      <wps:cNvSpPr txBox="1">
+                        <a:spLocks/>
+                      </wps:cNvSpPr>
                       <wps:spPr>
                         <a:xfrm>
                           <a:off x="0" y="0"/>
@@ -4516,7 +4557,8 @@
           </mc:Choice>
           <mc:Fallback>
             <w:pict>
-              <v:shape style="position:absolute;margin-left:207.429993pt;margin-top:16.361328pt;width:191.15pt;height:176.6pt;mso-position-horizontal-relative:page;mso-position-vertical-relative:paragraph;z-index:-15722496;mso-wrap-distance-left:0;mso-wrap-distance-right:0" type="#_x0000_t202" id="docshape12" filled="true" fillcolor="#cccccc" stroked="true" strokeweight="1.5pt" strokecolor="#042333">
+              <v:shape w14:anchorId="6F04BD9B" id="Textbox 13" o:spid="_x0000_s1036" type="#_x0000_t202" style="position:absolute;margin-left:207.45pt;margin-top:16.35pt;width:191.15pt;height:176.6pt;z-index:-15722496;visibility:visible;mso-wrap-style:square;mso-wrap-distance-left:0;mso-wrap-distance-top:0;mso-wrap-distance-right:0;mso-wrap-distance-bottom:0;mso-position-horizontal:absolute;mso-position-horizontal-relative:page;mso-position-vertical:absolute;mso-position-vertical-relative:text;v-text-anchor:top" o:gfxdata="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" fillcolor="#ccc" strokecolor="#042333" strokeweight="1.5pt">
+                <v:path arrowok="t"/>
                 <v:textbox inset="0,0,0,0">
                   <w:txbxContent>
                     <w:p>
@@ -4563,9 +4605,7 @@
                     </w:p>
                   </w:txbxContent>
                 </v:textbox>
-                <v:fill type="solid"/>
-                <v:stroke dashstyle="solid"/>
-                <w10:wrap type="topAndBottom"/>
+                <w10:wrap type="topAndBottom" anchorx="page"/>
               </v:shape>
             </w:pict>
           </mc:Fallback>
@@ -4573,12 +4613,13 @@
       </w:r>
       <w:r>
         <w:rPr>
+          <w:noProof/>
           <w:sz w:val="20"/>
         </w:rPr>
         <mc:AlternateContent>
           <mc:Choice Requires="wps">
             <w:drawing>
-              <wp:anchor distT="0" distB="0" distL="0" distR="0" allowOverlap="1" layoutInCell="1" locked="0" behindDoc="1" simplePos="0" relativeHeight="487594496">
+              <wp:anchor distT="0" distB="0" distL="0" distR="0" simplePos="0" relativeHeight="487594496" behindDoc="1" locked="0" layoutInCell="1" allowOverlap="1" wp14:anchorId="02F6637C" wp14:editId="41533D0D">
                 <wp:simplePos x="0" y="0"/>
                 <wp:positionH relativeFrom="page">
                   <wp:posOffset>6455283</wp:posOffset>
@@ -4591,13 +4632,14 @@
                 <wp:wrapTopAndBottom/>
                 <wp:docPr id="14" name="Textbox 14"/>
                 <wp:cNvGraphicFramePr>
-                  <a:graphicFrameLocks/>
+                  <a:graphicFrameLocks xmlns:a="http://schemas.openxmlformats.org/drawingml/2006/main"/>
                 </wp:cNvGraphicFramePr>
-                <a:graphic>
+                <a:graphic xmlns:a="http://schemas.openxmlformats.org/drawingml/2006/main">
                   <a:graphicData uri="http://schemas.microsoft.com/office/word/2010/wordprocessingShape">
                     <wps:wsp>
-                      <wps:cNvPr id="14" name="Textbox 14"/>
-                      <wps:cNvSpPr txBox="1"/>
+                      <wps:cNvSpPr txBox="1">
+                        <a:spLocks/>
+                      </wps:cNvSpPr>
                       <wps:spPr>
                         <a:xfrm>
                           <a:off x="0" y="0"/>
@@ -4645,8 +4687,7 @@
                           </w:p>
                           <w:p>
                             <w:pPr>
-                              <w:spacing w:before="0"/>
-                              <w:ind w:left="2" w:right="1" w:firstLine="0"/>
+                              <w:ind w:left="2" w:right="1"/>
                               <w:jc w:val="center"/>
                               <w:rPr>
                                 <w:color w:val="000000"/>
@@ -4693,7 +4734,8 @@
           </mc:Choice>
           <mc:Fallback>
             <w:pict>
-              <v:shape style="position:absolute;margin-left:508.290009pt;margin-top:16.361328pt;width:207.45pt;height:176.6pt;mso-position-horizontal-relative:page;mso-position-vertical-relative:paragraph;z-index:-15721984;mso-wrap-distance-left:0;mso-wrap-distance-right:0" type="#_x0000_t202" id="docshape13" filled="true" fillcolor="#155f82" stroked="true" strokeweight="1.5pt" strokecolor="#042333">
+              <v:shape w14:anchorId="02F6637C" id="Textbox 14" o:spid="_x0000_s1037" type="#_x0000_t202" style="position:absolute;margin-left:508.3pt;margin-top:16.35pt;width:207.45pt;height:176.6pt;z-index:-15721984;visibility:visible;mso-wrap-style:square;mso-wrap-distance-left:0;mso-wrap-distance-top:0;mso-wrap-distance-right:0;mso-wrap-distance-bottom:0;mso-position-horizontal:absolute;mso-position-horizontal-relative:page;mso-position-vertical:absolute;mso-position-vertical-relative:text;v-text-anchor:top" o:gfxdata="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" fillcolor="#155f82" strokecolor="#042333" strokeweight="1.5pt">
+                <v:path arrowok="t"/>
                 <v:textbox inset="0,0,0,0">
                   <w:txbxContent>
                     <w:p>
@@ -4723,8 +4765,7 @@
                     </w:p>
                     <w:p>
                       <w:pPr>
-                        <w:spacing w:before="0"/>
-                        <w:ind w:left="2" w:right="1" w:firstLine="0"/>
+                        <w:ind w:left="2" w:right="1"/>
                         <w:jc w:val="center"/>
                         <w:rPr>
                           <w:color w:val="000000"/>
@@ -4760,9 +4801,7 @@
                     </w:p>
                   </w:txbxContent>
                 </v:textbox>
-                <v:fill type="solid"/>
-                <v:stroke dashstyle="solid"/>
-                <w10:wrap type="topAndBottom"/>
+                <w10:wrap type="topAndBottom" anchorx="page"/>
               </v:shape>
             </w:pict>
           </mc:Fallback>
@@ -4772,13 +4811,13 @@
     <w:p>
       <w:pPr>
         <w:pStyle w:val="BodyText"/>
-        <w:spacing w:after="0"/>
         <w:rPr>
           <w:sz w:val="20"/>
         </w:rPr>
         <w:sectPr>
           <w:pgSz w:w="19200" w:h="10800" w:orient="landscape"/>
-          <w:pgMar w:top="560" w:bottom="280" w:left="425" w:right="141"/>
+          <w:pgMar w:top="560" w:right="141" w:bottom="280" w:left="425" w:header="720" w:footer="720" w:gutter="0"/>
+          <w:cols w:space="720"/>
         </w:sectPr>
       </w:pPr>
     </w:p>
@@ -4792,10 +4831,12 @@
       </w:pPr>
       <w:r>
         <w:rPr>
+          <w:noProof/>
           <w:sz w:val="17"/>
         </w:rPr>
+        <w:lastRenderedPageBreak/>
         <w:drawing>
-          <wp:anchor distT="0" distB="0" distL="0" distR="0" allowOverlap="1" layoutInCell="1" locked="0" behindDoc="0" simplePos="0" relativeHeight="15735808">
+          <wp:anchor distT="0" distB="0" distL="0" distR="0" simplePos="0" relativeHeight="15735808" behindDoc="0" locked="0" layoutInCell="1" allowOverlap="1" wp14:anchorId="3159ED9F" wp14:editId="61FDCBB2">
             <wp:simplePos x="0" y="0"/>
             <wp:positionH relativeFrom="page">
               <wp:posOffset>0</wp:posOffset>
@@ -4808,17 +4849,17 @@
             <wp:wrapNone/>
             <wp:docPr id="15" name="Image 15"/>
             <wp:cNvGraphicFramePr>
-              <a:graphicFrameLocks/>
+              <a:graphicFrameLocks xmlns:a="http://schemas.openxmlformats.org/drawingml/2006/main"/>
             </wp:cNvGraphicFramePr>
-            <a:graphic>
+            <a:graphic xmlns:a="http://schemas.openxmlformats.org/drawingml/2006/main">
               <a:graphicData uri="http://schemas.openxmlformats.org/drawingml/2006/picture">
-                <pic:pic>
+                <pic:pic xmlns:pic="http://schemas.openxmlformats.org/drawingml/2006/picture">
                   <pic:nvPicPr>
                     <pic:cNvPr id="15" name="Image 15"/>
                     <pic:cNvPicPr/>
                   </pic:nvPicPr>
                   <pic:blipFill>
-                    <a:blip r:embed="rId6" cstate="print"/>
+                    <a:blip r:embed="rId5" cstate="print"/>
                     <a:stretch>
                       <a:fillRect/>
                     </a:stretch>
@@ -4838,34 +4879,27 @@
           </wp:anchor>
         </w:drawing>
       </w:r>
-      <w:bookmarkStart w:name="Slide 6" w:id="9"/>
-      <w:bookmarkEnd w:id="9"/>
-      <w:r>
-        <w:rPr/>
-      </w:r>
-      <w:r>
-        <w:rPr>
-          <w:sz w:val="17"/>
-        </w:rPr>
-      </w:r>
+      <w:bookmarkStart w:id="8" w:name="Slide_6"/>
+      <w:bookmarkEnd w:id="8"/>
     </w:p>
     <w:sectPr>
       <w:pgSz w:w="19200" w:h="10800" w:orient="landscape"/>
-      <w:pgMar w:top="1220" w:bottom="280" w:left="425" w:right="141"/>
+      <w:pgMar w:top="1220" w:right="141" w:bottom="280" w:left="425" w:header="720" w:footer="720" w:gutter="0"/>
+      <w:cols w:space="720"/>
     </w:sectPr>
   </w:body>
 </w:document>
 </file>
 
 <file path=word/styles.xml><?xml version="1.0" encoding="utf-8"?>
-<w:styles xmlns:r="http://schemas.openxmlformats.org/officeDocument/2006/relationships" xmlns:w="http://schemas.openxmlformats.org/wordprocessingml/2006/main">
+<w:styles xmlns:mc="http://schemas.openxmlformats.org/markup-compatibility/2006" xmlns:r="http://schemas.openxmlformats.org/officeDocument/2006/relationships" xmlns:w="http://schemas.openxmlformats.org/wordprocessingml/2006/main" xmlns:w14="http://schemas.microsoft.com/office/word/2010/wordml" xmlns:w15="http://schemas.microsoft.com/office/word/2012/wordml" xmlns:w16cex="http://schemas.microsoft.com/office/word/2018/wordml/cex" xmlns:w16cid="http://schemas.microsoft.com/office/word/2016/wordml/cid" xmlns:w16="http://schemas.microsoft.com/office/word/2018/wordml" xmlns:w16du="http://schemas.microsoft.com/office/word/2023/wordml/word16du" xmlns:w16sdtdh="http://schemas.microsoft.com/office/word/2020/wordml/sdtdatahash" xmlns:w16sdtfl="http://schemas.microsoft.com/office/word/2024/wordml/sdtformatlock" xmlns:w16se="http://schemas.microsoft.com/office/word/2015/wordml/symex" mc:Ignorable="w14 w15 w16se w16cid w16 w16cex w16sdtdh w16sdtfl w16du">
   <w:docDefaults>
     <w:rPrDefault>
       <w:rPr>
-        <w:rFonts w:cstheme="minorBidi" w:hAnsiTheme="minorHAnsi" w:eastAsiaTheme="minorHAnsi" w:asciiTheme="minorHAnsi"/>
+        <w:rFonts w:asciiTheme="minorHAnsi" w:eastAsiaTheme="minorHAnsi" w:hAnsiTheme="minorHAnsi" w:cstheme="minorBidi"/>
         <w:sz w:val="22"/>
         <w:szCs w:val="22"/>
-        <w:lang w:val="en-US" w:bidi="ar-SA" w:eastAsia="en-US"/>
+        <w:lang w:val="en-US" w:eastAsia="en-US" w:bidi="ar-SA"/>
       </w:rPr>
     </w:rPrDefault>
     <w:pPrDefault>
@@ -4873,83 +4907,441 @@
         <w:widowControl w:val="0"/>
         <w:autoSpaceDE w:val="0"/>
         <w:autoSpaceDN w:val="0"/>
-        <w:spacing w:lineRule="auto" w:line="240" w:before="0" w:after="0"/>
-        <w:ind w:left="0" w:right="0"/>
-        <w:jc w:val="left"/>
       </w:pPr>
     </w:pPrDefault>
   </w:docDefaults>
-  <w:style w:styleId="DefaultParagraphFont" w:default="1" w:type="character">
+  <w:latentStyles w:defLockedState="0" w:defUIPriority="99" w:defSemiHidden="0" w:defUnhideWhenUsed="0" w:defQFormat="0" w:count="376">
+    <w:lsdException w:name="Normal" w:uiPriority="0" w:qFormat="1"/>
+    <w:lsdException w:name="heading 1" w:uiPriority="9" w:qFormat="1"/>
+    <w:lsdException w:name="heading 2" w:semiHidden="1" w:uiPriority="9" w:unhideWhenUsed="1" w:qFormat="1"/>
+    <w:lsdException w:name="heading 3" w:semiHidden="1" w:uiPriority="9" w:unhideWhenUsed="1" w:qFormat="1"/>
+    <w:lsdException w:name="heading 4" w:semiHidden="1" w:uiPriority="9" w:unhideWhenUsed="1" w:qFormat="1"/>
+    <w:lsdException w:name="heading 5" w:semiHidden="1" w:uiPriority="9" w:unhideWhenUsed="1" w:qFormat="1"/>
+    <w:lsdException w:name="heading 6" w:semiHidden="1" w:uiPriority="9" w:unhideWhenUsed="1" w:qFormat="1"/>
+    <w:lsdException w:name="heading 7" w:semiHidden="1" w:uiPriority="9" w:unhideWhenUsed="1" w:qFormat="1"/>
+    <w:lsdException w:name="heading 8" w:semiHidden="1" w:uiPriority="9" w:unhideWhenUsed="1" w:qFormat="1"/>
+    <w:lsdException w:name="heading 9" w:semiHidden="1" w:uiPriority="9" w:unhideWhenUsed="1" w:qFormat="1"/>
+    <w:lsdException w:name="index 1" w:semiHidden="1" w:unhideWhenUsed="1"/>
+    <w:lsdException w:name="index 2" w:semiHidden="1" w:unhideWhenUsed="1"/>
+    <w:lsdException w:name="index 3" w:semiHidden="1" w:unhideWhenUsed="1"/>
+    <w:lsdException w:name="index 4" w:semiHidden="1" w:unhideWhenUsed="1"/>
+    <w:lsdException w:name="index 5" w:semiHidden="1" w:unhideWhenUsed="1"/>
+    <w:lsdException w:name="index 6" w:semiHidden="1" w:unhideWhenUsed="1"/>
+    <w:lsdException w:name="index 7" w:semiHidden="1" w:unhideWhenUsed="1"/>
+    <w:lsdException w:name="index 8" w:semiHidden="1" w:unhideWhenUsed="1"/>
+    <w:lsdException w:name="index 9" w:semiHidden="1" w:unhideWhenUsed="1"/>
+    <w:lsdException w:name="toc 1" w:semiHidden="1" w:uiPriority="39" w:unhideWhenUsed="1"/>
+    <w:lsdException w:name="toc 2" w:semiHidden="1" w:uiPriority="39" w:unhideWhenUsed="1"/>
+    <w:lsdException w:name="toc 3" w:semiHidden="1" w:uiPriority="39" w:unhideWhenUsed="1"/>
+    <w:lsdException w:name="toc 4" w:semiHidden="1" w:uiPriority="39" w:unhideWhenUsed="1"/>
+    <w:lsdException w:name="toc 5" w:semiHidden="1" w:uiPriority="39" w:unhideWhenUsed="1"/>
+    <w:lsdException w:name="toc 6" w:semiHidden="1" w:uiPriority="39" w:unhideWhenUsed="1"/>
+    <w:lsdException w:name="toc 7" w:semiHidden="1" w:uiPriority="39" w:unhideWhenUsed="1"/>
+    <w:lsdException w:name="toc 8" w:semiHidden="1" w:uiPriority="39" w:unhideWhenUsed="1"/>
+    <w:lsdException w:name="toc 9" w:semiHidden="1" w:uiPriority="39" w:unhideWhenUsed="1"/>
+    <w:lsdException w:name="Normal Indent" w:semiHidden="1" w:unhideWhenUsed="1"/>
+    <w:lsdException w:name="footnote text" w:semiHidden="1" w:unhideWhenUsed="1"/>
+    <w:lsdException w:name="annotation text" w:semiHidden="1" w:unhideWhenUsed="1"/>
+    <w:lsdException w:name="header" w:semiHidden="1" w:unhideWhenUsed="1"/>
+    <w:lsdException w:name="footer" w:semiHidden="1" w:unhideWhenUsed="1"/>
+    <w:lsdException w:name="index heading" w:semiHidden="1" w:unhideWhenUsed="1"/>
+    <w:lsdException w:name="caption" w:semiHidden="1" w:uiPriority="35" w:unhideWhenUsed="1" w:qFormat="1"/>
+    <w:lsdException w:name="table of figures" w:semiHidden="1" w:unhideWhenUsed="1"/>
+    <w:lsdException w:name="envelope address" w:semiHidden="1" w:unhideWhenUsed="1"/>
+    <w:lsdException w:name="envelope return" w:semiHidden="1" w:unhideWhenUsed="1"/>
+    <w:lsdException w:name="footnote reference" w:semiHidden="1" w:unhideWhenUsed="1"/>
+    <w:lsdException w:name="annotation reference" w:semiHidden="1" w:unhideWhenUsed="1"/>
+    <w:lsdException w:name="line number" w:semiHidden="1" w:unhideWhenUsed="1"/>
+    <w:lsdException w:name="page number" w:semiHidden="1" w:unhideWhenUsed="1"/>
+    <w:lsdException w:name="endnote reference" w:semiHidden="1" w:unhideWhenUsed="1"/>
+    <w:lsdException w:name="endnote text" w:semiHidden="1" w:unhideWhenUsed="1"/>
+    <w:lsdException w:name="table of authorities" w:semiHidden="1" w:unhideWhenUsed="1"/>
+    <w:lsdException w:name="macro" w:semiHidden="1" w:unhideWhenUsed="1"/>
+    <w:lsdException w:name="toa heading" w:semiHidden="1" w:unhideWhenUsed="1"/>
+    <w:lsdException w:name="List" w:semiHidden="1" w:unhideWhenUsed="1"/>
+    <w:lsdException w:name="List Bullet" w:semiHidden="1" w:unhideWhenUsed="1"/>
+    <w:lsdException w:name="List Number" w:semiHidden="1" w:unhideWhenUsed="1"/>
+    <w:lsdException w:name="List 2" w:semiHidden="1" w:unhideWhenUsed="1"/>
+    <w:lsdException w:name="List 3" w:semiHidden="1" w:unhideWhenUsed="1"/>
+    <w:lsdException w:name="List 4" w:semiHidden="1" w:unhideWhenUsed="1"/>
+    <w:lsdException w:name="List 5" w:semiHidden="1" w:unhideWhenUsed="1"/>
+    <w:lsdException w:name="List Bullet 2" w:semiHidden="1" w:unhideWhenUsed="1"/>
+    <w:lsdException w:name="List Bullet 3" w:semiHidden="1" w:unhideWhenUsed="1"/>
+    <w:lsdException w:name="List Bullet 4" w:semiHidden="1" w:unhideWhenUsed="1"/>
+    <w:lsdException w:name="List Bullet 5" w:semiHidden="1" w:unhideWhenUsed="1"/>
+    <w:lsdException w:name="List Number 2" w:semiHidden="1" w:unhideWhenUsed="1"/>
+    <w:lsdException w:name="List Number 3" w:semiHidden="1" w:unhideWhenUsed="1"/>
+    <w:lsdException w:name="List Number 4" w:semiHidden="1" w:unhideWhenUsed="1"/>
+    <w:lsdException w:name="List Number 5" w:semiHidden="1" w:unhideWhenUsed="1"/>
+    <w:lsdException w:name="Title" w:uiPriority="10" w:qFormat="1"/>
+    <w:lsdException w:name="Closing" w:semiHidden="1" w:unhideWhenUsed="1"/>
+    <w:lsdException w:name="Signature" w:semiHidden="1" w:unhideWhenUsed="1"/>
+    <w:lsdException w:name="Default Paragraph Font" w:semiHidden="1" w:uiPriority="1" w:unhideWhenUsed="1"/>
+    <w:lsdException w:name="Body Text" w:semiHidden="1" w:unhideWhenUsed="1"/>
+    <w:lsdException w:name="Body Text Indent" w:semiHidden="1" w:unhideWhenUsed="1"/>
+    <w:lsdException w:name="List Continue" w:semiHidden="1" w:unhideWhenUsed="1"/>
+    <w:lsdException w:name="List Continue 2" w:semiHidden="1" w:unhideWhenUsed="1"/>
+    <w:lsdException w:name="List Continue 3" w:semiHidden="1" w:unhideWhenUsed="1"/>
+    <w:lsdException w:name="List Continue 4" w:semiHidden="1" w:unhideWhenUsed="1"/>
+    <w:lsdException w:name="List Continue 5" w:semiHidden="1" w:unhideWhenUsed="1"/>
+    <w:lsdException w:name="Message Header" w:semiHidden="1" w:unhideWhenUsed="1"/>
+    <w:lsdException w:name="Subtitle" w:uiPriority="11" w:qFormat="1"/>
+    <w:lsdException w:name="Salutation" w:semiHidden="1" w:unhideWhenUsed="1"/>
+    <w:lsdException w:name="Date" w:semiHidden="1" w:unhideWhenUsed="1"/>
+    <w:lsdException w:name="Body Text First Indent" w:semiHidden="1" w:unhideWhenUsed="1"/>
+    <w:lsdException w:name="Body Text First Indent 2" w:semiHidden="1" w:unhideWhenUsed="1"/>
+    <w:lsdException w:name="Note Heading" w:semiHidden="1" w:unhideWhenUsed="1"/>
+    <w:lsdException w:name="Body Text 2" w:semiHidden="1" w:unhideWhenUsed="1"/>
+    <w:lsdException w:name="Body Text 3" w:semiHidden="1" w:unhideWhenUsed="1"/>
+    <w:lsdException w:name="Body Text Indent 2" w:semiHidden="1" w:unhideWhenUsed="1"/>
+    <w:lsdException w:name="Body Text Indent 3" w:semiHidden="1" w:unhideWhenUsed="1"/>
+    <w:lsdException w:name="Block Text" w:semiHidden="1" w:unhideWhenUsed="1"/>
+    <w:lsdException w:name="Hyperlink" w:semiHidden="1" w:unhideWhenUsed="1"/>
+    <w:lsdException w:name="FollowedHyperlink" w:semiHidden="1" w:unhideWhenUsed="1"/>
+    <w:lsdException w:name="Strong" w:uiPriority="22" w:qFormat="1"/>
+    <w:lsdException w:name="Emphasis" w:uiPriority="20" w:qFormat="1"/>
+    <w:lsdException w:name="Document Map" w:semiHidden="1" w:unhideWhenUsed="1"/>
+    <w:lsdException w:name="Plain Text" w:semiHidden="1" w:unhideWhenUsed="1"/>
+    <w:lsdException w:name="E-mail Signature" w:semiHidden="1" w:unhideWhenUsed="1"/>
+    <w:lsdException w:name="HTML Top of Form" w:semiHidden="1" w:unhideWhenUsed="1"/>
+    <w:lsdException w:name="HTML Bottom of Form" w:semiHidden="1" w:unhideWhenUsed="1"/>
+    <w:lsdException w:name="Normal (Web)" w:semiHidden="1" w:unhideWhenUsed="1"/>
+    <w:lsdException w:name="HTML Acronym" w:semiHidden="1" w:unhideWhenUsed="1"/>
+    <w:lsdException w:name="HTML Address" w:semiHidden="1" w:unhideWhenUsed="1"/>
+    <w:lsdException w:name="HTML Cite" w:semiHidden="1" w:unhideWhenUsed="1"/>
+    <w:lsdException w:name="HTML Code" w:semiHidden="1" w:unhideWhenUsed="1"/>
+    <w:lsdException w:name="HTML Definition" w:semiHidden="1" w:unhideWhenUsed="1"/>
+    <w:lsdException w:name="HTML Keyboard" w:semiHidden="1" w:unhideWhenUsed="1"/>
+    <w:lsdException w:name="HTML Preformatted" w:semiHidden="1" w:unhideWhenUsed="1"/>
+    <w:lsdException w:name="HTML Sample" w:semiHidden="1" w:unhideWhenUsed="1"/>
+    <w:lsdException w:name="HTML Typewriter" w:semiHidden="1" w:unhideWhenUsed="1"/>
+    <w:lsdException w:name="HTML Variable" w:semiHidden="1" w:unhideWhenUsed="1"/>
+    <w:lsdException w:name="Normal Table" w:semiHidden="1" w:unhideWhenUsed="1"/>
+    <w:lsdException w:name="annotation subject" w:semiHidden="1" w:unhideWhenUsed="1"/>
+    <w:lsdException w:name="No List" w:semiHidden="1" w:unhideWhenUsed="1"/>
+    <w:lsdException w:name="Outline List 1" w:semiHidden="1" w:unhideWhenUsed="1"/>
+    <w:lsdException w:name="Outline List 2" w:semiHidden="1" w:unhideWhenUsed="1"/>
+    <w:lsdException w:name="Outline List 3" w:semiHidden="1" w:unhideWhenUsed="1"/>
+    <w:lsdException w:name="Table Simple 1" w:semiHidden="1" w:unhideWhenUsed="1"/>
+    <w:lsdException w:name="Table Simple 2" w:semiHidden="1" w:unhideWhenUsed="1"/>
+    <w:lsdException w:name="Table Simple 3" w:semiHidden="1" w:unhideWhenUsed="1"/>
+    <w:lsdException w:name="Table Classic 1" w:semiHidden="1" w:unhideWhenUsed="1"/>
+    <w:lsdException w:name="Table Classic 2" w:semiHidden="1" w:unhideWhenUsed="1"/>
+    <w:lsdException w:name="Table Classic 3" w:semiHidden="1" w:unhideWhenUsed="1"/>
+    <w:lsdException w:name="Table Classic 4" w:semiHidden="1" w:unhideWhenUsed="1"/>
+    <w:lsdException w:name="Table Colorful 1" w:semiHidden="1" w:unhideWhenUsed="1"/>
+    <w:lsdException w:name="Table Colorful 2" w:semiHidden="1" w:unhideWhenUsed="1"/>
+    <w:lsdException w:name="Table Colorful 3" w:semiHidden="1" w:unhideWhenUsed="1"/>
+    <w:lsdException w:name="Table Columns 1" w:semiHidden="1" w:unhideWhenUsed="1"/>
+    <w:lsdException w:name="Table Columns 2" w:semiHidden="1" w:unhideWhenUsed="1"/>
+    <w:lsdException w:name="Table Columns 3" w:semiHidden="1" w:unhideWhenUsed="1"/>
+    <w:lsdException w:name="Table Columns 4" w:semiHidden="1" w:unhideWhenUsed="1"/>
+    <w:lsdException w:name="Table Columns 5" w:semiHidden="1" w:unhideWhenUsed="1"/>
+    <w:lsdException w:name="Table Grid 1" w:semiHidden="1" w:unhideWhenUsed="1"/>
+    <w:lsdException w:name="Table Grid 2" w:semiHidden="1" w:unhideWhenUsed="1"/>
+    <w:lsdException w:name="Table Grid 3" w:semiHidden="1" w:unhideWhenUsed="1"/>
+    <w:lsdException w:name="Table Grid 4" w:semiHidden="1" w:unhideWhenUsed="1"/>
+    <w:lsdException w:name="Table Grid 5" w:semiHidden="1" w:unhideWhenUsed="1"/>
+    <w:lsdException w:name="Table Grid 6" w:semiHidden="1" w:unhideWhenUsed="1"/>
+    <w:lsdException w:name="Table Grid 7" w:semiHidden="1" w:unhideWhenUsed="1"/>
+    <w:lsdException w:name="Table Grid 8" w:semiHidden="1" w:unhideWhenUsed="1"/>
+    <w:lsdException w:name="Table List 1" w:semiHidden="1" w:unhideWhenUsed="1"/>
+    <w:lsdException w:name="Table List 2" w:semiHidden="1" w:unhideWhenUsed="1"/>
+    <w:lsdException w:name="Table List 3" w:semiHidden="1" w:unhideWhenUsed="1"/>
+    <w:lsdException w:name="Table List 4" w:semiHidden="1" w:unhideWhenUsed="1"/>
+    <w:lsdException w:name="Table List 5" w:semiHidden="1" w:unhideWhenUsed="1"/>
+    <w:lsdException w:name="Table List 6" w:semiHidden="1" w:unhideWhenUsed="1"/>
+    <w:lsdException w:name="Table List 7" w:semiHidden="1" w:unhideWhenUsed="1"/>
+    <w:lsdException w:name="Table List 8" w:semiHidden="1" w:unhideWhenUsed="1"/>
+    <w:lsdException w:name="Table 3D effects 1" w:semiHidden="1" w:unhideWhenUsed="1"/>
+    <w:lsdException w:name="Table 3D effects 2" w:semiHidden="1" w:unhideWhenUsed="1"/>
+    <w:lsdException w:name="Table 3D effects 3" w:semiHidden="1" w:unhideWhenUsed="1"/>
+    <w:lsdException w:name="Table Contemporary" w:semiHidden="1" w:unhideWhenUsed="1"/>
+    <w:lsdException w:name="Table Elegant" w:semiHidden="1" w:unhideWhenUsed="1"/>
+    <w:lsdException w:name="Table Professional" w:semiHidden="1" w:unhideWhenUsed="1"/>
+    <w:lsdException w:name="Table Subtle 1" w:semiHidden="1" w:unhideWhenUsed="1"/>
+    <w:lsdException w:name="Table Subtle 2" w:semiHidden="1" w:unhideWhenUsed="1"/>
+    <w:lsdException w:name="Table Web 1" w:semiHidden="1" w:unhideWhenUsed="1"/>
+    <w:lsdException w:name="Table Web 2" w:semiHidden="1" w:unhideWhenUsed="1"/>
+    <w:lsdException w:name="Table Web 3" w:semiHidden="1" w:unhideWhenUsed="1"/>
+    <w:lsdException w:name="Balloon Text" w:semiHidden="1" w:unhideWhenUsed="1"/>
+    <w:lsdException w:name="Table Grid" w:uiPriority="39"/>
+    <w:lsdException w:name="Table Theme" w:semiHidden="1" w:unhideWhenUsed="1"/>
+    <w:lsdException w:name="Placeholder Text" w:semiHidden="1"/>
+    <w:lsdException w:name="No Spacing" w:uiPriority="1" w:qFormat="1"/>
+    <w:lsdException w:name="Light Shading" w:uiPriority="60"/>
+    <w:lsdException w:name="Light List" w:uiPriority="61"/>
+    <w:lsdException w:name="Light Grid" w:uiPriority="62"/>
+    <w:lsdException w:name="Medium Shading 1" w:uiPriority="63"/>
+    <w:lsdException w:name="Medium Shading 2" w:uiPriority="64"/>
+    <w:lsdException w:name="Medium List 1" w:uiPriority="65"/>
+    <w:lsdException w:name="Medium List 2" w:uiPriority="66"/>
+    <w:lsdException w:name="Medium Grid 1" w:uiPriority="67"/>
+    <w:lsdException w:name="Medium Grid 2" w:uiPriority="68"/>
+    <w:lsdException w:name="Medium Grid 3" w:uiPriority="69"/>
+    <w:lsdException w:name="Dark List" w:uiPriority="70"/>
+    <w:lsdException w:name="Colorful Shading" w:uiPriority="71"/>
+    <w:lsdException w:name="Colorful List" w:uiPriority="72"/>
+    <w:lsdException w:name="Colorful Grid" w:uiPriority="73"/>
+    <w:lsdException w:name="Light Shading Accent 1" w:uiPriority="60"/>
+    <w:lsdException w:name="Light List Accent 1" w:uiPriority="61"/>
+    <w:lsdException w:name="Light Grid Accent 1" w:uiPriority="62"/>
+    <w:lsdException w:name="Medium Shading 1 Accent 1" w:uiPriority="63"/>
+    <w:lsdException w:name="Medium Shading 2 Accent 1" w:uiPriority="64"/>
+    <w:lsdException w:name="Medium List 1 Accent 1" w:uiPriority="65"/>
+    <w:lsdException w:name="Revision" w:semiHidden="1"/>
+    <w:lsdException w:name="List Paragraph" w:uiPriority="34" w:qFormat="1"/>
+    <w:lsdException w:name="Quote" w:uiPriority="29" w:qFormat="1"/>
+    <w:lsdException w:name="Intense Quote" w:uiPriority="30" w:qFormat="1"/>
+    <w:lsdException w:name="Medium List 2 Accent 1" w:uiPriority="66"/>
+    <w:lsdException w:name="Medium Grid 1 Accent 1" w:uiPriority="67"/>
+    <w:lsdException w:name="Medium Grid 2 Accent 1" w:uiPriority="68"/>
+    <w:lsdException w:name="Medium Grid 3 Accent 1" w:uiPriority="69"/>
+    <w:lsdException w:name="Dark List Accent 1" w:uiPriority="70"/>
+    <w:lsdException w:name="Colorful Shading Accent 1" w:uiPriority="71"/>
+    <w:lsdException w:name="Colorful List Accent 1" w:uiPriority="72"/>
+    <w:lsdException w:name="Colorful Grid Accent 1" w:uiPriority="73"/>
+    <w:lsdException w:name="Light Shading Accent 2" w:uiPriority="60"/>
+    <w:lsdException w:name="Light List Accent 2" w:uiPriority="61"/>
+    <w:lsdException w:name="Light Grid Accent 2" w:uiPriority="62"/>
+    <w:lsdException w:name="Medium Shading 1 Accent 2" w:uiPriority="63"/>
+    <w:lsdException w:name="Medium Shading 2 Accent 2" w:uiPriority="64"/>
+    <w:lsdException w:name="Medium List 1 Accent 2" w:uiPriority="65"/>
+    <w:lsdException w:name="Medium List 2 Accent 2" w:uiPriority="66"/>
+    <w:lsdException w:name="Medium Grid 1 Accent 2" w:uiPriority="67"/>
+    <w:lsdException w:name="Medium Grid 2 Accent 2" w:uiPriority="68"/>
+    <w:lsdException w:name="Medium Grid 3 Accent 2" w:uiPriority="69"/>
+    <w:lsdException w:name="Dark List Accent 2" w:uiPriority="70"/>
+    <w:lsdException w:name="Colorful Shading Accent 2" w:uiPriority="71"/>
+    <w:lsdException w:name="Colorful List Accent 2" w:uiPriority="72"/>
+    <w:lsdException w:name="Colorful Grid Accent 2" w:uiPriority="73"/>
+    <w:lsdException w:name="Light Shading Accent 3" w:uiPriority="60"/>
+    <w:lsdException w:name="Light List Accent 3" w:uiPriority="61"/>
+    <w:lsdException w:name="Light Grid Accent 3" w:uiPriority="62"/>
+    <w:lsdException w:name="Medium Shading 1 Accent 3" w:uiPriority="63"/>
+    <w:lsdException w:name="Medium Shading 2 Accent 3" w:uiPriority="64"/>
+    <w:lsdException w:name="Medium List 1 Accent 3" w:uiPriority="65"/>
+    <w:lsdException w:name="Medium List 2 Accent 3" w:uiPriority="66"/>
+    <w:lsdException w:name="Medium Grid 1 Accent 3" w:uiPriority="67"/>
+    <w:lsdException w:name="Medium Grid 2 Accent 3" w:uiPriority="68"/>
+    <w:lsdException w:name="Medium Grid 3 Accent 3" w:uiPriority="69"/>
+    <w:lsdException w:name="Dark List Accent 3" w:uiPriority="70"/>
+    <w:lsdException w:name="Colorful Shading Accent 3" w:uiPriority="71"/>
+    <w:lsdException w:name="Colorful List Accent 3" w:uiPriority="72"/>
+    <w:lsdException w:name="Colorful Grid Accent 3" w:uiPriority="73"/>
+    <w:lsdException w:name="Light Shading Accent 4" w:uiPriority="60"/>
+    <w:lsdException w:name="Light List Accent 4" w:uiPriority="61"/>
+    <w:lsdException w:name="Light Grid Accent 4" w:uiPriority="62"/>
+    <w:lsdException w:name="Medium Shading 1 Accent 4" w:uiPriority="63"/>
+    <w:lsdException w:name="Medium Shading 2 Accent 4" w:uiPriority="64"/>
+    <w:lsdException w:name="Medium List 1 Accent 4" w:uiPriority="65"/>
+    <w:lsdException w:name="Medium List 2 Accent 4" w:uiPriority="66"/>
+    <w:lsdException w:name="Medium Grid 1 Accent 4" w:uiPriority="67"/>
+    <w:lsdException w:name="Medium Grid 2 Accent 4" w:uiPriority="68"/>
+    <w:lsdException w:name="Medium Grid 3 Accent 4" w:uiPriority="69"/>
+    <w:lsdException w:name="Dark List Accent 4" w:uiPriority="70"/>
+    <w:lsdException w:name="Colorful Shading Accent 4" w:uiPriority="71"/>
+    <w:lsdException w:name="Colorful List Accent 4" w:uiPriority="72"/>
+    <w:lsdException w:name="Colorful Grid Accent 4" w:uiPriority="73"/>
+    <w:lsdException w:name="Light Shading Accent 5" w:uiPriority="60"/>
+    <w:lsdException w:name="Light List Accent 5" w:uiPriority="61"/>
+    <w:lsdException w:name="Light Grid Accent 5" w:uiPriority="62"/>
+    <w:lsdException w:name="Medium Shading 1 Accent 5" w:uiPriority="63"/>
+    <w:lsdException w:name="Medium Shading 2 Accent 5" w:uiPriority="64"/>
+    <w:lsdException w:name="Medium List 1 Accent 5" w:uiPriority="65"/>
+    <w:lsdException w:name="Medium List 2 Accent 5" w:uiPriority="66"/>
+    <w:lsdException w:name="Medium Grid 1 Accent 5" w:uiPriority="67"/>
+    <w:lsdException w:name="Medium Grid 2 Accent 5" w:uiPriority="68"/>
+    <w:lsdException w:name="Medium Grid 3 Accent 5" w:uiPriority="69"/>
+    <w:lsdException w:name="Dark List Accent 5" w:uiPriority="70"/>
+    <w:lsdException w:name="Colorful Shading Accent 5" w:uiPriority="71"/>
+    <w:lsdException w:name="Colorful List Accent 5" w:uiPriority="72"/>
+    <w:lsdException w:name="Colorful Grid Accent 5" w:uiPriority="73"/>
+    <w:lsdException w:name="Light Shading Accent 6" w:uiPriority="60"/>
+    <w:lsdException w:name="Light List Accent 6" w:uiPriority="61"/>
+    <w:lsdException w:name="Light Grid Accent 6" w:uiPriority="62"/>
+    <w:lsdException w:name="Medium Shading 1 Accent 6" w:uiPriority="63"/>
+    <w:lsdException w:name="Medium Shading 2 Accent 6" w:uiPriority="64"/>
+    <w:lsdException w:name="Medium List 1 Accent 6" w:uiPriority="65"/>
+    <w:lsdException w:name="Medium List 2 Accent 6" w:uiPriority="66"/>
+    <w:lsdException w:name="Medium Grid 1 Accent 6" w:uiPriority="67"/>
+    <w:lsdException w:name="Medium Grid 2 Accent 6" w:uiPriority="68"/>
+    <w:lsdException w:name="Medium Grid 3 Accent 6" w:uiPriority="69"/>
+    <w:lsdException w:name="Dark List Accent 6" w:uiPriority="70"/>
+    <w:lsdException w:name="Colorful Shading Accent 6" w:uiPriority="71"/>
+    <w:lsdException w:name="Colorful List Accent 6" w:uiPriority="72"/>
+    <w:lsdException w:name="Colorful Grid Accent 6" w:uiPriority="73"/>
+    <w:lsdException w:name="Subtle Emphasis" w:uiPriority="19" w:qFormat="1"/>
+    <w:lsdException w:name="Intense Emphasis" w:uiPriority="21" w:qFormat="1"/>
+    <w:lsdException w:name="Subtle Reference" w:uiPriority="31" w:qFormat="1"/>
+    <w:lsdException w:name="Intense Reference" w:uiPriority="32" w:qFormat="1"/>
+    <w:lsdException w:name="Book Title" w:uiPriority="33" w:qFormat="1"/>
+    <w:lsdException w:name="Bibliography" w:semiHidden="1" w:uiPriority="37" w:unhideWhenUsed="1"/>
+    <w:lsdException w:name="TOC Heading" w:semiHidden="1" w:uiPriority="39" w:unhideWhenUsed="1" w:qFormat="1"/>
+    <w:lsdException w:name="Plain Table 1" w:uiPriority="41"/>
+    <w:lsdException w:name="Plain Table 2" w:uiPriority="42"/>
+    <w:lsdException w:name="Plain Table 3" w:uiPriority="43"/>
+    <w:lsdException w:name="Plain Table 4" w:uiPriority="44"/>
+    <w:lsdException w:name="Plain Table 5" w:uiPriority="45"/>
+    <w:lsdException w:name="Grid Table Light" w:uiPriority="40"/>
+    <w:lsdException w:name="Grid Table 1 Light" w:uiPriority="46"/>
+    <w:lsdException w:name="Grid Table 2" w:uiPriority="47"/>
+    <w:lsdException w:name="Grid Table 3" w:uiPriority="48"/>
+    <w:lsdException w:name="Grid Table 4" w:uiPriority="49"/>
+    <w:lsdException w:name="Grid Table 5 Dark" w:uiPriority="50"/>
+    <w:lsdException w:name="Grid Table 6 Colorful" w:uiPriority="51"/>
+    <w:lsdException w:name="Grid Table 7 Colorful" w:uiPriority="52"/>
+    <w:lsdException w:name="Grid Table 1 Light Accent 1" w:uiPriority="46"/>
+    <w:lsdException w:name="Grid Table 2 Accent 1" w:uiPriority="47"/>
+    <w:lsdException w:name="Grid Table 3 Accent 1" w:uiPriority="48"/>
+    <w:lsdException w:name="Grid Table 4 Accent 1" w:uiPriority="49"/>
+    <w:lsdException w:name="Grid Table 5 Dark Accent 1" w:uiPriority="50"/>
+    <w:lsdException w:name="Grid Table 6 Colorful Accent 1" w:uiPriority="51"/>
+    <w:lsdException w:name="Grid Table 7 Colorful Accent 1" w:uiPriority="52"/>
+    <w:lsdException w:name="Grid Table 1 Light Accent 2" w:uiPriority="46"/>
+    <w:lsdException w:name="Grid Table 2 Accent 2" w:uiPriority="47"/>
+    <w:lsdException w:name="Grid Table 3 Accent 2" w:uiPriority="48"/>
+    <w:lsdException w:name="Grid Table 4 Accent 2" w:uiPriority="49"/>
+    <w:lsdException w:name="Grid Table 5 Dark Accent 2" w:uiPriority="50"/>
+    <w:lsdException w:name="Grid Table 6 Colorful Accent 2" w:uiPriority="51"/>
+    <w:lsdException w:name="Grid Table 7 Colorful Accent 2" w:uiPriority="52"/>
+    <w:lsdException w:name="Grid Table 1 Light Accent 3" w:uiPriority="46"/>
+    <w:lsdException w:name="Grid Table 2 Accent 3" w:uiPriority="47"/>
+    <w:lsdException w:name="Grid Table 3 Accent 3" w:uiPriority="48"/>
+    <w:lsdException w:name="Grid Table 4 Accent 3" w:uiPriority="49"/>
+    <w:lsdException w:name="Grid Table 5 Dark Accent 3" w:uiPriority="50"/>
+    <w:lsdException w:name="Grid Table 6 Colorful Accent 3" w:uiPriority="51"/>
+    <w:lsdException w:name="Grid Table 7 Colorful Accent 3" w:uiPriority="52"/>
+    <w:lsdException w:name="Grid Table 1 Light Accent 4" w:uiPriority="46"/>
+    <w:lsdException w:name="Grid Table 2 Accent 4" w:uiPriority="47"/>
+    <w:lsdException w:name="Grid Table 3 Accent 4" w:uiPriority="48"/>
+    <w:lsdException w:name="Grid Table 4 Accent 4" w:uiPriority="49"/>
+    <w:lsdException w:name="Grid Table 5 Dark Accent 4" w:uiPriority="50"/>
+    <w:lsdException w:name="Grid Table 6 Colorful Accent 4" w:uiPriority="51"/>
+    <w:lsdException w:name="Grid Table 7 Colorful Accent 4" w:uiPriority="52"/>
+    <w:lsdException w:name="Grid Table 1 Light Accent 5" w:uiPriority="46"/>
+    <w:lsdException w:name="Grid Table 2 Accent 5" w:uiPriority="47"/>
+    <w:lsdException w:name="Grid Table 3 Accent 5" w:uiPriority="48"/>
+    <w:lsdException w:name="Grid Table 4 Accent 5" w:uiPriority="49"/>
+    <w:lsdException w:name="Grid Table 5 Dark Accent 5" w:uiPriority="50"/>
+    <w:lsdException w:name="Grid Table 6 Colorful Accent 5" w:uiPriority="51"/>
+    <w:lsdException w:name="Grid Table 7 Colorful Accent 5" w:uiPriority="52"/>
+    <w:lsdException w:name="Grid Table 1 Light Accent 6" w:uiPriority="46"/>
+    <w:lsdException w:name="Grid Table 2 Accent 6" w:uiPriority="47"/>
+    <w:lsdException w:name="Grid Table 3 Accent 6" w:uiPriority="48"/>
+    <w:lsdException w:name="Grid Table 4 Accent 6" w:uiPriority="49"/>
+    <w:lsdException w:name="Grid Table 5 Dark Accent 6" w:uiPriority="50"/>
+    <w:lsdException w:name="Grid Table 6 Colorful Accent 6" w:uiPriority="51"/>
+    <w:lsdException w:name="Grid Table 7 Colorful Accent 6" w:uiPriority="52"/>
+    <w:lsdException w:name="List Table 1 Light" w:uiPriority="46"/>
+    <w:lsdException w:name="List Table 2" w:uiPriority="47"/>
+    <w:lsdException w:name="List Table 3" w:uiPriority="48"/>
+    <w:lsdException w:name="List Table 4" w:uiPriority="49"/>
+    <w:lsdException w:name="List Table 5 Dark" w:uiPriority="50"/>
+    <w:lsdException w:name="List Table 6 Colorful" w:uiPriority="51"/>
+    <w:lsdException w:name="List Table 7 Colorful" w:uiPriority="52"/>
+    <w:lsdException w:name="List Table 1 Light Accent 1" w:uiPriority="46"/>
+    <w:lsdException w:name="List Table 2 Accent 1" w:uiPriority="47"/>
+    <w:lsdException w:name="List Table 3 Accent 1" w:uiPriority="48"/>
+    <w:lsdException w:name="List Table 4 Accent 1" w:uiPriority="49"/>
+    <w:lsdException w:name="List Table 5 Dark Accent 1" w:uiPriority="50"/>
+    <w:lsdException w:name="List Table 6 Colorful Accent 1" w:uiPriority="51"/>
+    <w:lsdException w:name="List Table 7 Colorful Accent 1" w:uiPriority="52"/>
+    <w:lsdException w:name="List Table 1 Light Accent 2" w:uiPriority="46"/>
+    <w:lsdException w:name="List Table 2 Accent 2" w:uiPriority="47"/>
+    <w:lsdException w:name="List Table 3 Accent 2" w:uiPriority="48"/>
+    <w:lsdException w:name="List Table 4 Accent 2" w:uiPriority="49"/>
+    <w:lsdException w:name="List Table 5 Dark Accent 2" w:uiPriority="50"/>
+    <w:lsdException w:name="List Table 6 Colorful Accent 2" w:uiPriority="51"/>
+    <w:lsdException w:name="List Table 7 Colorful Accent 2" w:uiPriority="52"/>
+    <w:lsdException w:name="List Table 1 Light Accent 3" w:uiPriority="46"/>
+    <w:lsdException w:name="List Table 2 Accent 3" w:uiPriority="47"/>
+    <w:lsdException w:name="List Table 3 Accent 3" w:uiPriority="48"/>
+    <w:lsdException w:name="List Table 4 Accent 3" w:uiPriority="49"/>
+    <w:lsdException w:name="List Table 5 Dark Accent 3" w:uiPriority="50"/>
+    <w:lsdException w:name="List Table 6 Colorful Accent 3" w:uiPriority="51"/>
+    <w:lsdException w:name="List Table 7 Colorful Accent 3" w:uiPriority="52"/>
+    <w:lsdException w:name="List Table 1 Light Accent 4" w:uiPriority="46"/>
+    <w:lsdException w:name="List Table 2 Accent 4" w:uiPriority="47"/>
+    <w:lsdException w:name="List Table 3 Accent 4" w:uiPriority="48"/>
+    <w:lsdException w:name="List Table 4 Accent 4" w:uiPriority="49"/>
+    <w:lsdException w:name="List Table 5 Dark Accent 4" w:uiPriority="50"/>
+    <w:lsdException w:name="List Table 6 Colorful Accent 4" w:uiPriority="51"/>
+    <w:lsdException w:name="List Table 7 Colorful Accent 4" w:uiPriority="52"/>
+    <w:lsdException w:name="List Table 1 Light Accent 5" w:uiPriority="46"/>
+    <w:lsdException w:name="List Table 2 Accent 5" w:uiPriority="47"/>
+    <w:lsdException w:name="List Table 3 Accent 5" w:uiPriority="48"/>
+    <w:lsdException w:name="List Table 4 Accent 5" w:uiPriority="49"/>
+    <w:lsdException w:name="List Table 5 Dark Accent 5" w:uiPriority="50"/>
+    <w:lsdException w:name="List Table 6 Colorful Accent 5" w:uiPriority="51"/>
+    <w:lsdException w:name="List Table 7 Colorful Accent 5" w:uiPriority="52"/>
+    <w:lsdException w:name="List Table 1 Light Accent 6" w:uiPriority="46"/>
+    <w:lsdException w:name="List Table 2 Accent 6" w:uiPriority="47"/>
+    <w:lsdException w:name="List Table 3 Accent 6" w:uiPriority="48"/>
+    <w:lsdException w:name="List Table 4 Accent 6" w:uiPriority="49"/>
+    <w:lsdException w:name="List Table 5 Dark Accent 6" w:uiPriority="50"/>
+    <w:lsdException w:name="List Table 6 Colorful Accent 6" w:uiPriority="51"/>
+    <w:lsdException w:name="List Table 7 Colorful Accent 6" w:uiPriority="52"/>
+    <w:lsdException w:name="Mention" w:semiHidden="1" w:unhideWhenUsed="1"/>
+    <w:lsdException w:name="Smart Hyperlink" w:semiHidden="1" w:unhideWhenUsed="1"/>
+    <w:lsdException w:name="Hashtag" w:semiHidden="1" w:unhideWhenUsed="1"/>
+    <w:lsdException w:name="Unresolved Mention" w:semiHidden="1" w:unhideWhenUsed="1"/>
+    <w:lsdException w:name="Smart Link" w:semiHidden="1" w:unhideWhenUsed="1"/>
+  </w:latentStyles>
+  <w:style w:type="paragraph" w:default="1" w:styleId="Normal">
+    <w:name w:val="Normal"/>
+    <w:qFormat/>
+    <w:rPr>
+      <w:rFonts w:ascii="Trebuchet MS" w:eastAsia="Trebuchet MS" w:hAnsi="Trebuchet MS" w:cs="Trebuchet MS"/>
+    </w:rPr>
+  </w:style>
+  <w:style w:type="character" w:default="1" w:styleId="DefaultParagraphFont">
     <w:name w:val="Default Paragraph Font"/>
     <w:uiPriority w:val="1"/>
+    <w:unhideWhenUsed/>
+  </w:style>
+  <w:style w:type="table" w:default="1" w:styleId="TableNormal">
+    <w:name w:val="Normal Table"/>
+    <w:uiPriority w:val="99"/>
     <w:semiHidden/>
     <w:unhideWhenUsed/>
-  </w:style>
-  <w:style w:styleId="TableNormal" w:default="1" w:type="table">
-    <w:name w:val="Table Normal"/>
-    <w:uiPriority w:val="2"/>
-    <w:semiHidden/>
-    <w:unhideWhenUsed/>
-    <w:qFormat/>
     <w:tblPr>
       <w:tblInd w:w="0" w:type="dxa"/>
       <w:tblCellMar>
         <w:top w:w="0" w:type="dxa"/>
-        <w:left w:w="0" w:type="dxa"/>
+        <w:left w:w="108" w:type="dxa"/>
         <w:bottom w:w="0" w:type="dxa"/>
-        <w:right w:w="0" w:type="dxa"/>
+        <w:right w:w="108" w:type="dxa"/>
       </w:tblCellMar>
     </w:tblPr>
   </w:style>
-  <w:style w:styleId="NoList" w:default="1" w:type="numbering">
+  <w:style w:type="numbering" w:default="1" w:styleId="NoList">
     <w:name w:val="No List"/>
     <w:uiPriority w:val="99"/>
     <w:semiHidden/>
     <w:unhideWhenUsed/>
   </w:style>
-  <w:style w:default="1" w:styleId="Normal" w:type="paragraph">
-    <w:name w:val="Normal"/>
-    <w:uiPriority w:val="1"/>
-    <w:qFormat/>
-    <w:pPr/>
-    <w:rPr>
-      <w:rFonts w:ascii="Trebuchet MS" w:hAnsi="Trebuchet MS" w:eastAsia="Trebuchet MS" w:cs="Trebuchet MS"/>
-      <w:lang w:val="en-US" w:eastAsia="en-US" w:bidi="ar-SA"/>
-    </w:rPr>
-  </w:style>
-  <w:style w:styleId="BodyText" w:type="paragraph">
+  <w:style w:type="paragraph" w:styleId="BodyText">
     <w:name w:val="Body Text"/>
     <w:basedOn w:val="Normal"/>
     <w:uiPriority w:val="1"/>
     <w:qFormat/>
-    <w:pPr/>
     <w:rPr>
-      <w:rFonts w:ascii="Trebuchet MS" w:hAnsi="Trebuchet MS" w:eastAsia="Trebuchet MS" w:cs="Trebuchet MS"/>
       <w:sz w:val="36"/>
       <w:szCs w:val="36"/>
-      <w:lang w:val="en-US" w:eastAsia="en-US" w:bidi="ar-SA"/>
     </w:rPr>
   </w:style>
-  <w:style w:styleId="ListParagraph" w:type="paragraph">
+  <w:style w:type="paragraph" w:styleId="ListParagraph">
     <w:name w:val="List Paragraph"/>
     <w:basedOn w:val="Normal"/>
     <w:uiPriority w:val="1"/>
     <w:qFormat/>
-    <w:pPr/>
-    <w:rPr>
-      <w:lang w:val="en-US" w:eastAsia="en-US" w:bidi="ar-SA"/>
-    </w:rPr>
   </w:style>
-  <w:style w:styleId="TableParagraph" w:type="paragraph">
+  <w:style w:type="paragraph" w:customStyle="1" w:styleId="TableParagraph">
     <w:name w:val="Table Paragraph"/>
     <w:basedOn w:val="Normal"/>
     <w:uiPriority w:val="1"/>
     <w:qFormat/>
-    <w:pPr/>
-    <w:rPr>
-      <w:rFonts w:ascii="Trebuchet MS" w:hAnsi="Trebuchet MS" w:eastAsia="Trebuchet MS" w:cs="Trebuchet MS"/>
-      <w:lang w:val="en-US" w:eastAsia="en-US" w:bidi="ar-SA"/>
-    </w:rPr>
   </w:style>
 </w:styles>
 </file>

</xml_diff>